<commit_message>
Adicionar vídeo da apresentação aos entregáveis
</commit_message>
<xml_diff>
--- a/relatorios/finais/relatorio-pratico-pedidos-veloz.docx
+++ b/relatorios/finais/relatorio-pratico-pedidos-veloz.docx
@@ -84,12 +84,10 @@
       <w:r>
         <w:rPr>
           <w:rFonts w:ascii="Arial" w:hAnsi="Arial" w:eastAsia="Arial" w:cs="Arial"/>
-          <w:b w:val="0"/>
-          <w:i w:val="0"/>
           <w:color w:val="000000"/>
           <w:sz w:val="24"/>
         </w:rPr>
-        <w:t>Vídeo: link será inserido após a gravação</w:t>
+        <w:t>Vídeo da apresentação: https://youtu.be/uwSEwUH-t7k</w:t>
       </w:r>
     </w:p>
     <w:p>
@@ -97,6 +95,12 @@
         <w:pStyle w:val="Heading1"/>
       </w:pPr>
       <w:r>
+        <w:rPr>
+          <w:rFonts w:ascii="Arial" w:hAnsi="Arial" w:eastAsia="Arial" w:cs="Arial"/>
+          <w:b/>
+          <w:color w:val="000000"/>
+          <w:sz w:val="24"/>
+        </w:rPr>
         <w:t>Visão geral da solução</w:t>
       </w:r>
     </w:p>
@@ -136,7 +140,7 @@
         <w:tc>
           <w:tcPr>
             <w:tcW w:type="dxa" w:w="1800"/>
-            <w:shd w:fill="F2F4F7"/>
+            <w:shd w:fill="FFFFFF" w:color="auto"/>
             <w:tcMar>
               <w:top w:w="80" w:type="dxa"/>
               <w:bottom w:w="80" w:type="dxa"/>
@@ -164,7 +168,7 @@
         <w:tc>
           <w:tcPr>
             <w:tcW w:type="dxa" w:w="2300"/>
-            <w:shd w:fill="F2F4F7"/>
+            <w:shd w:fill="FFFFFF" w:color="auto"/>
             <w:tcMar>
               <w:top w:w="80" w:type="dxa"/>
               <w:bottom w:w="80" w:type="dxa"/>
@@ -192,7 +196,7 @@
         <w:tc>
           <w:tcPr>
             <w:tcW w:type="dxa" w:w="5260"/>
-            <w:shd w:fill="F2F4F7"/>
+            <w:shd w:fill="FFFFFF" w:color="auto"/>
             <w:tcMar>
               <w:top w:w="80" w:type="dxa"/>
               <w:bottom w:w="80" w:type="dxa"/>
@@ -561,6 +565,12 @@
         <w:pStyle w:val="Heading2"/>
       </w:pPr>
       <w:r>
+        <w:rPr>
+          <w:rFonts w:ascii="Arial" w:hAnsi="Arial" w:eastAsia="Arial" w:cs="Arial"/>
+          <w:b/>
+          <w:color w:val="000000"/>
+          <w:sz w:val="24"/>
+        </w:rPr>
         <w:t>Contrato assíncrono</w:t>
       </w:r>
     </w:p>
@@ -598,6 +608,11 @@
     </w:p>
     <w:p>
       <w:r>
+        <w:rPr>
+          <w:rFonts w:ascii="Arial" w:hAnsi="Arial" w:eastAsia="Arial" w:cs="Arial"/>
+          <w:color w:val="000000"/>
+          <w:sz w:val="24"/>
+        </w:rPr>
         <w:br w:type="page"/>
       </w:r>
     </w:p>
@@ -606,6 +621,12 @@
         <w:pStyle w:val="Heading1"/>
       </w:pPr>
       <w:r>
+        <w:rPr>
+          <w:rFonts w:ascii="Arial" w:hAnsi="Arial" w:eastAsia="Arial" w:cs="Arial"/>
+          <w:b/>
+          <w:color w:val="000000"/>
+          <w:sz w:val="24"/>
+        </w:rPr>
         <w:t>Ambiente local e conteinerização</w:t>
       </w:r>
     </w:p>
@@ -646,6 +667,12 @@
         <w:pStyle w:val="Heading2"/>
       </w:pPr>
       <w:r>
+        <w:rPr>
+          <w:rFonts w:ascii="Arial" w:hAnsi="Arial" w:eastAsia="Arial" w:cs="Arial"/>
+          <w:b/>
+          <w:color w:val="000000"/>
+          <w:sz w:val="24"/>
+        </w:rPr>
         <w:t>Execução local</w:t>
       </w:r>
     </w:p>
@@ -685,7 +712,7 @@
         <w:tc>
           <w:tcPr>
             <w:tcW w:type="dxa" w:w="1900"/>
-            <w:shd w:fill="F2F4F7"/>
+            <w:shd w:fill="FFFFFF" w:color="auto"/>
             <w:tcMar>
               <w:top w:w="80" w:type="dxa"/>
               <w:bottom w:w="80" w:type="dxa"/>
@@ -713,7 +740,7 @@
         <w:tc>
           <w:tcPr>
             <w:tcW w:type="dxa" w:w="2500"/>
-            <w:shd w:fill="F2F4F7"/>
+            <w:shd w:fill="FFFFFF" w:color="auto"/>
             <w:tcMar>
               <w:top w:w="80" w:type="dxa"/>
               <w:bottom w:w="80" w:type="dxa"/>
@@ -741,7 +768,7 @@
         <w:tc>
           <w:tcPr>
             <w:tcW w:type="dxa" w:w="4960"/>
-            <w:shd w:fill="F2F4F7"/>
+            <w:shd w:fill="FFFFFF" w:color="auto"/>
             <w:tcMar>
               <w:top w:w="80" w:type="dxa"/>
               <w:bottom w:w="80" w:type="dxa"/>
@@ -1123,6 +1150,11 @@
     </w:p>
     <w:p>
       <w:r>
+        <w:rPr>
+          <w:rFonts w:ascii="Arial" w:hAnsi="Arial" w:eastAsia="Arial" w:cs="Arial"/>
+          <w:color w:val="000000"/>
+          <w:sz w:val="24"/>
+        </w:rPr>
         <w:br w:type="page"/>
       </w:r>
     </w:p>
@@ -1131,6 +1163,12 @@
         <w:pStyle w:val="Heading1"/>
       </w:pPr>
       <w:r>
+        <w:rPr>
+          <w:rFonts w:ascii="Arial" w:hAnsi="Arial" w:eastAsia="Arial" w:cs="Arial"/>
+          <w:b/>
+          <w:color w:val="000000"/>
+          <w:sz w:val="24"/>
+        </w:rPr>
         <w:t>Kubernetes: configuração entregue</w:t>
       </w:r>
     </w:p>
@@ -1171,6 +1209,12 @@
         <w:pStyle w:val="Heading2"/>
       </w:pPr>
       <w:r>
+        <w:rPr>
+          <w:rFonts w:ascii="Arial" w:hAnsi="Arial" w:eastAsia="Arial" w:cs="Arial"/>
+          <w:b/>
+          <w:color w:val="000000"/>
+          <w:sz w:val="24"/>
+        </w:rPr>
         <w:t>Configuração e segurança</w:t>
       </w:r>
     </w:p>
@@ -1209,7 +1253,7 @@
         <w:tc>
           <w:tcPr>
             <w:tcW w:type="dxa" w:w="2300"/>
-            <w:shd w:fill="F2F4F7"/>
+            <w:shd w:fill="FFFFFF" w:color="auto"/>
             <w:tcMar>
               <w:top w:w="80" w:type="dxa"/>
               <w:bottom w:w="80" w:type="dxa"/>
@@ -1237,7 +1281,7 @@
         <w:tc>
           <w:tcPr>
             <w:tcW w:type="dxa" w:w="7060"/>
-            <w:shd w:fill="F2F4F7"/>
+            <w:shd w:fill="FFFFFF" w:color="auto"/>
             <w:tcMar>
               <w:top w:w="80" w:type="dxa"/>
               <w:bottom w:w="80" w:type="dxa"/>
@@ -1567,6 +1611,11 @@
     </w:p>
     <w:p>
       <w:r>
+        <w:rPr>
+          <w:rFonts w:ascii="Arial" w:hAnsi="Arial" w:eastAsia="Arial" w:cs="Arial"/>
+          <w:color w:val="000000"/>
+          <w:sz w:val="24"/>
+        </w:rPr>
         <w:br w:type="page"/>
       </w:r>
     </w:p>
@@ -1575,6 +1624,12 @@
         <w:pStyle w:val="Heading1"/>
       </w:pPr>
       <w:r>
+        <w:rPr>
+          <w:rFonts w:ascii="Arial" w:hAnsi="Arial" w:eastAsia="Arial" w:cs="Arial"/>
+          <w:b/>
+          <w:color w:val="000000"/>
+          <w:sz w:val="24"/>
+        </w:rPr>
         <w:t>CI/CD, imagens e GitHub</w:t>
       </w:r>
     </w:p>
@@ -1615,6 +1670,12 @@
         <w:pStyle w:val="Heading2"/>
       </w:pPr>
       <w:r>
+        <w:rPr>
+          <w:rFonts w:ascii="Arial" w:hAnsi="Arial" w:eastAsia="Arial" w:cs="Arial"/>
+          <w:b/>
+          <w:color w:val="000000"/>
+          <w:sz w:val="24"/>
+        </w:rPr>
         <w:t>Deploy protegido e rollback</w:t>
       </w:r>
     </w:p>
@@ -1639,6 +1700,12 @@
         <w:pStyle w:val="Heading2"/>
       </w:pPr>
       <w:r>
+        <w:rPr>
+          <w:rFonts w:ascii="Arial" w:hAnsi="Arial" w:eastAsia="Arial" w:cs="Arial"/>
+          <w:b/>
+          <w:color w:val="000000"/>
+          <w:sz w:val="24"/>
+        </w:rPr>
         <w:t>Infraestrutura como código</w:t>
       </w:r>
     </w:p>
@@ -1677,7 +1744,7 @@
         <w:tc>
           <w:tcPr>
             <w:tcW w:type="dxa" w:w="2300"/>
-            <w:shd w:fill="F2F4F7"/>
+            <w:shd w:fill="FFFFFF" w:color="auto"/>
             <w:tcMar>
               <w:top w:w="80" w:type="dxa"/>
               <w:bottom w:w="80" w:type="dxa"/>
@@ -1705,7 +1772,7 @@
         <w:tc>
           <w:tcPr>
             <w:tcW w:type="dxa" w:w="7060"/>
-            <w:shd w:fill="F2F4F7"/>
+            <w:shd w:fill="FFFFFF" w:color="auto"/>
             <w:tcMar>
               <w:top w:w="80" w:type="dxa"/>
               <w:bottom w:w="80" w:type="dxa"/>
@@ -1907,6 +1974,11 @@
     </w:p>
     <w:p>
       <w:r>
+        <w:rPr>
+          <w:rFonts w:ascii="Arial" w:hAnsi="Arial" w:eastAsia="Arial" w:cs="Arial"/>
+          <w:color w:val="000000"/>
+          <w:sz w:val="24"/>
+        </w:rPr>
         <w:br w:type="page"/>
       </w:r>
     </w:p>
@@ -1915,6 +1987,12 @@
         <w:pStyle w:val="Heading1"/>
       </w:pPr>
       <w:r>
+        <w:rPr>
+          <w:rFonts w:ascii="Arial" w:hAnsi="Arial" w:eastAsia="Arial" w:cs="Arial"/>
+          <w:b/>
+          <w:color w:val="000000"/>
+          <w:sz w:val="24"/>
+        </w:rPr>
         <w:t>Observabilidade e resiliência</w:t>
       </w:r>
     </w:p>
@@ -1955,6 +2033,12 @@
         <w:pStyle w:val="Heading2"/>
       </w:pPr>
       <w:r>
+        <w:rPr>
+          <w:rFonts w:ascii="Arial" w:hAnsi="Arial" w:eastAsia="Arial" w:cs="Arial"/>
+          <w:b/>
+          <w:color w:val="000000"/>
+          <w:sz w:val="24"/>
+        </w:rPr>
         <w:t>Validações executadas</w:t>
       </w:r>
     </w:p>
@@ -1977,7 +2061,7 @@
         <w:tc>
           <w:tcPr>
             <w:tcW w:type="dxa" w:w="2700"/>
-            <w:shd w:fill="F2F4F7"/>
+            <w:shd w:fill="FFFFFF" w:color="auto"/>
             <w:tcMar>
               <w:top w:w="80" w:type="dxa"/>
               <w:bottom w:w="80" w:type="dxa"/>
@@ -2005,7 +2089,7 @@
         <w:tc>
           <w:tcPr>
             <w:tcW w:type="dxa" w:w="6660"/>
-            <w:shd w:fill="F2F4F7"/>
+            <w:shd w:fill="FFFFFF" w:color="auto"/>
             <w:tcMar>
               <w:top w:w="80" w:type="dxa"/>
               <w:bottom w:w="80" w:type="dxa"/>
@@ -2394,6 +2478,12 @@
         <w:pStyle w:val="Heading2"/>
       </w:pPr>
       <w:r>
+        <w:rPr>
+          <w:rFonts w:ascii="Arial" w:hAnsi="Arial" w:eastAsia="Arial" w:cs="Arial"/>
+          <w:b/>
+          <w:color w:val="000000"/>
+          <w:sz w:val="24"/>
+        </w:rPr>
         <w:t>Riscos remanescentes</w:t>
       </w:r>
     </w:p>
@@ -2415,6 +2505,11 @@
     </w:p>
     <w:p>
       <w:r>
+        <w:rPr>
+          <w:rFonts w:ascii="Arial" w:hAnsi="Arial" w:eastAsia="Arial" w:cs="Arial"/>
+          <w:color w:val="000000"/>
+          <w:sz w:val="24"/>
+        </w:rPr>
         <w:br w:type="page"/>
       </w:r>
     </w:p>
@@ -2423,6 +2518,12 @@
         <w:pStyle w:val="Heading1"/>
       </w:pPr>
       <w:r>
+        <w:rPr>
+          <w:rFonts w:ascii="Arial" w:hAnsi="Arial" w:eastAsia="Arial" w:cs="Arial"/>
+          <w:b/>
+          <w:color w:val="000000"/>
+          <w:sz w:val="24"/>
+        </w:rPr>
         <w:t>Estado atual do projeto</w:t>
       </w:r>
     </w:p>
@@ -2477,7 +2578,7 @@
         <w:tc>
           <w:tcPr>
             <w:tcW w:type="dxa" w:w="2500"/>
-            <w:shd w:fill="F2F4F7"/>
+            <w:shd w:fill="FFFFFF" w:color="auto"/>
             <w:tcMar>
               <w:top w:w="80" w:type="dxa"/>
               <w:bottom w:w="80" w:type="dxa"/>
@@ -2505,7 +2606,7 @@
         <w:tc>
           <w:tcPr>
             <w:tcW w:type="dxa" w:w="6860"/>
-            <w:shd w:fill="F2F4F7"/>
+            <w:shd w:fill="FFFFFF" w:color="auto"/>
             <w:tcMar>
               <w:top w:w="80" w:type="dxa"/>
               <w:bottom w:w="80" w:type="dxa"/>
@@ -2822,6 +2923,12 @@
         <w:pStyle w:val="Heading2"/>
       </w:pPr>
       <w:r>
+        <w:rPr>
+          <w:rFonts w:ascii="Arial" w:hAnsi="Arial" w:eastAsia="Arial" w:cs="Arial"/>
+          <w:b/>
+          <w:color w:val="000000"/>
+          <w:sz w:val="24"/>
+        </w:rPr>
         <w:t>Conclusão</w:t>
       </w:r>
     </w:p>
@@ -2846,6 +2953,12 @@
         <w:pStyle w:val="Heading2"/>
       </w:pPr>
       <w:r>
+        <w:rPr>
+          <w:rFonts w:ascii="Arial" w:hAnsi="Arial" w:eastAsia="Arial" w:cs="Arial"/>
+          <w:b/>
+          <w:color w:val="000000"/>
+          <w:sz w:val="24"/>
+        </w:rPr>
         <w:t>Referências essenciais</w:t>
       </w:r>
     </w:p>
@@ -3379,6 +3492,7 @@
     </w:pPr>
     <w:rPr>
       <w:rFonts w:ascii="Arial" w:hAnsi="Arial" w:eastAsia="Arial" w:cs="Arial"/>
+      <w:color w:val="000000"/>
       <w:sz w:val="24"/>
     </w:rPr>
   </w:style>
@@ -3396,6 +3510,11 @@
       </w:tabs>
       <w:spacing w:after="0" w:line="240" w:lineRule="auto"/>
     </w:pPr>
+    <w:rPr>
+      <w:rFonts w:ascii="Arial" w:hAnsi="Arial" w:eastAsia="Arial" w:cs="Arial"/>
+      <w:color w:val="000000"/>
+      <w:sz w:val="24"/>
+    </w:rPr>
   </w:style>
   <w:style w:type="character" w:customStyle="1" w:styleId="HeaderChar">
     <w:name w:val="Header Char"/>
@@ -3403,6 +3522,11 @@
     <w:link w:val="Header"/>
     <w:uiPriority w:val="99"/>
     <w:rsid w:val="00E618BF"/>
+    <w:rPr>
+      <w:rFonts w:ascii="Arial" w:hAnsi="Arial" w:eastAsia="Arial" w:cs="Arial"/>
+      <w:color w:val="000000"/>
+      <w:sz w:val="24"/>
+    </w:rPr>
   </w:style>
   <w:style w:type="paragraph" w:styleId="Footer">
     <w:name w:val="footer"/>
@@ -3418,6 +3542,11 @@
       </w:tabs>
       <w:spacing w:after="0" w:line="240" w:lineRule="auto"/>
     </w:pPr>
+    <w:rPr>
+      <w:rFonts w:ascii="Arial" w:hAnsi="Arial" w:eastAsia="Arial" w:cs="Arial"/>
+      <w:color w:val="000000"/>
+      <w:sz w:val="24"/>
+    </w:rPr>
   </w:style>
   <w:style w:type="character" w:customStyle="1" w:styleId="FooterChar">
     <w:name w:val="Footer Char"/>
@@ -3425,6 +3554,11 @@
     <w:link w:val="Footer"/>
     <w:uiPriority w:val="99"/>
     <w:rsid w:val="00E618BF"/>
+    <w:rPr>
+      <w:rFonts w:ascii="Arial" w:hAnsi="Arial" w:eastAsia="Arial" w:cs="Arial"/>
+      <w:color w:val="000000"/>
+      <w:sz w:val="24"/>
+    </w:rPr>
   </w:style>
   <w:style w:type="paragraph" w:styleId="Heading1">
     <w:name w:val="heading 1"/>
@@ -3513,12 +3647,13 @@
       <w:outlineLvl w:val="3"/>
     </w:pPr>
     <w:rPr>
-      <w:rFonts w:asciiTheme="majorHAnsi" w:eastAsiaTheme="majorEastAsia" w:hAnsiTheme="majorHAnsi" w:cstheme="majorBidi"/>
+      <w:rFonts w:asciiTheme="majorHAnsi" w:eastAsiaTheme="majorEastAsia" w:hAnsiTheme="majorHAnsi" w:cstheme="majorBidi" w:ascii="Arial" w:hAnsi="Arial" w:eastAsia="Arial" w:cs="Arial"/>
       <w:b/>
       <w:bCs/>
       <w:i/>
       <w:iCs/>
-      <w:color w:val="4F81BD" w:themeColor="accent1"/>
+      <w:color w:val="000000"/>
+      <w:sz w:val="24"/>
     </w:rPr>
   </w:style>
   <w:style w:type="paragraph" w:styleId="Heading5">
@@ -3538,8 +3673,9 @@
       <w:outlineLvl w:val="4"/>
     </w:pPr>
     <w:rPr>
-      <w:rFonts w:asciiTheme="majorHAnsi" w:eastAsiaTheme="majorEastAsia" w:hAnsiTheme="majorHAnsi" w:cstheme="majorBidi"/>
-      <w:color w:val="243F60" w:themeColor="accent1" w:themeShade="7F"/>
+      <w:rFonts w:asciiTheme="majorHAnsi" w:eastAsiaTheme="majorEastAsia" w:hAnsiTheme="majorHAnsi" w:cstheme="majorBidi" w:ascii="Arial" w:hAnsi="Arial" w:eastAsia="Arial" w:cs="Arial"/>
+      <w:color w:val="000000"/>
+      <w:sz w:val="24"/>
     </w:rPr>
   </w:style>
   <w:style w:type="paragraph" w:styleId="Heading6">
@@ -3559,10 +3695,11 @@
       <w:outlineLvl w:val="5"/>
     </w:pPr>
     <w:rPr>
-      <w:rFonts w:asciiTheme="majorHAnsi" w:eastAsiaTheme="majorEastAsia" w:hAnsiTheme="majorHAnsi" w:cstheme="majorBidi"/>
+      <w:rFonts w:asciiTheme="majorHAnsi" w:eastAsiaTheme="majorEastAsia" w:hAnsiTheme="majorHAnsi" w:cstheme="majorBidi" w:ascii="Arial" w:hAnsi="Arial" w:eastAsia="Arial" w:cs="Arial"/>
       <w:i/>
       <w:iCs/>
-      <w:color w:val="243F60" w:themeColor="accent1" w:themeShade="7F"/>
+      <w:color w:val="000000"/>
+      <w:sz w:val="24"/>
     </w:rPr>
   </w:style>
   <w:style w:type="paragraph" w:styleId="Heading7">
@@ -3582,10 +3719,11 @@
       <w:outlineLvl w:val="6"/>
     </w:pPr>
     <w:rPr>
-      <w:rFonts w:asciiTheme="majorHAnsi" w:eastAsiaTheme="majorEastAsia" w:hAnsiTheme="majorHAnsi" w:cstheme="majorBidi"/>
+      <w:rFonts w:asciiTheme="majorHAnsi" w:eastAsiaTheme="majorEastAsia" w:hAnsiTheme="majorHAnsi" w:cstheme="majorBidi" w:ascii="Arial" w:hAnsi="Arial" w:eastAsia="Arial" w:cs="Arial"/>
       <w:i/>
       <w:iCs/>
-      <w:color w:val="404040" w:themeColor="text1" w:themeTint="BF"/>
+      <w:color w:val="000000"/>
+      <w:sz w:val="24"/>
     </w:rPr>
   </w:style>
   <w:style w:type="paragraph" w:styleId="Heading8">
@@ -3605,9 +3743,9 @@
       <w:outlineLvl w:val="7"/>
     </w:pPr>
     <w:rPr>
-      <w:rFonts w:asciiTheme="majorHAnsi" w:eastAsiaTheme="majorEastAsia" w:hAnsiTheme="majorHAnsi" w:cstheme="majorBidi"/>
-      <w:color w:val="4F81BD" w:themeColor="accent1"/>
-      <w:sz w:val="20"/>
+      <w:rFonts w:asciiTheme="majorHAnsi" w:eastAsiaTheme="majorEastAsia" w:hAnsiTheme="majorHAnsi" w:cstheme="majorBidi" w:ascii="Arial" w:hAnsi="Arial" w:eastAsia="Arial" w:cs="Arial"/>
+      <w:color w:val="000000"/>
+      <w:sz w:val="24"/>
       <w:szCs w:val="20"/>
     </w:rPr>
   </w:style>
@@ -3628,11 +3766,11 @@
       <w:outlineLvl w:val="8"/>
     </w:pPr>
     <w:rPr>
-      <w:rFonts w:asciiTheme="majorHAnsi" w:eastAsiaTheme="majorEastAsia" w:hAnsiTheme="majorHAnsi" w:cstheme="majorBidi"/>
+      <w:rFonts w:asciiTheme="majorHAnsi" w:eastAsiaTheme="majorEastAsia" w:hAnsiTheme="majorHAnsi" w:cstheme="majorBidi" w:ascii="Arial" w:hAnsi="Arial" w:eastAsia="Arial" w:cs="Arial"/>
       <w:i/>
       <w:iCs/>
-      <w:color w:val="404040" w:themeColor="text1" w:themeTint="BF"/>
-      <w:sz w:val="20"/>
+      <w:color w:val="000000"/>
+      <w:sz w:val="24"/>
       <w:szCs w:val="20"/>
     </w:rPr>
   </w:style>
@@ -3641,6 +3779,11 @@
     <w:uiPriority w:val="1"/>
     <w:semiHidden/>
     <w:unhideWhenUsed/>
+    <w:rPr>
+      <w:rFonts w:ascii="Arial" w:hAnsi="Arial" w:eastAsia="Arial" w:cs="Arial"/>
+      <w:color w:val="000000"/>
+      <w:sz w:val="24"/>
+    </w:rPr>
   </w:style>
   <w:style w:type="table" w:default="1" w:styleId="TableNormal">
     <w:name w:val="Normal Table"/>
@@ -3671,6 +3814,11 @@
     <w:pPr>
       <w:spacing w:after="0" w:line="240" w:lineRule="auto"/>
     </w:pPr>
+    <w:rPr>
+      <w:rFonts w:ascii="Arial" w:hAnsi="Arial" w:eastAsia="Arial" w:cs="Arial"/>
+      <w:color w:val="000000"/>
+      <w:sz w:val="24"/>
+    </w:rPr>
   </w:style>
   <w:style w:type="character" w:customStyle="1" w:styleId="Heading1Char">
     <w:name w:val="Heading 1 Char"/>
@@ -3679,11 +3827,11 @@
     <w:uiPriority w:val="9"/>
     <w:rsid w:val="00FC693F"/>
     <w:rPr>
-      <w:rFonts w:asciiTheme="majorHAnsi" w:eastAsiaTheme="majorEastAsia" w:hAnsiTheme="majorHAnsi" w:cstheme="majorBidi"/>
+      <w:rFonts w:asciiTheme="majorHAnsi" w:eastAsiaTheme="majorEastAsia" w:hAnsiTheme="majorHAnsi" w:cstheme="majorBidi" w:ascii="Arial" w:hAnsi="Arial" w:eastAsia="Arial" w:cs="Arial"/>
       <w:b/>
       <w:bCs/>
-      <w:color w:val="365F91" w:themeColor="accent1" w:themeShade="BF"/>
-      <w:sz w:val="28"/>
+      <w:color w:val="000000"/>
+      <w:sz w:val="24"/>
       <w:szCs w:val="28"/>
     </w:rPr>
   </w:style>
@@ -3694,11 +3842,11 @@
     <w:uiPriority w:val="9"/>
     <w:rsid w:val="00FC693F"/>
     <w:rPr>
-      <w:rFonts w:asciiTheme="majorHAnsi" w:eastAsiaTheme="majorEastAsia" w:hAnsiTheme="majorHAnsi" w:cstheme="majorBidi"/>
+      <w:rFonts w:asciiTheme="majorHAnsi" w:eastAsiaTheme="majorEastAsia" w:hAnsiTheme="majorHAnsi" w:cstheme="majorBidi" w:ascii="Arial" w:hAnsi="Arial" w:eastAsia="Arial" w:cs="Arial"/>
       <w:b/>
       <w:bCs/>
-      <w:color w:val="4F81BD" w:themeColor="accent1"/>
-      <w:sz w:val="26"/>
+      <w:color w:val="000000"/>
+      <w:sz w:val="24"/>
       <w:szCs w:val="26"/>
     </w:rPr>
   </w:style>
@@ -3709,10 +3857,11 @@
     <w:uiPriority w:val="9"/>
     <w:rsid w:val="00FC693F"/>
     <w:rPr>
-      <w:rFonts w:asciiTheme="majorHAnsi" w:eastAsiaTheme="majorEastAsia" w:hAnsiTheme="majorHAnsi" w:cstheme="majorBidi"/>
+      <w:rFonts w:asciiTheme="majorHAnsi" w:eastAsiaTheme="majorEastAsia" w:hAnsiTheme="majorHAnsi" w:cstheme="majorBidi" w:ascii="Arial" w:hAnsi="Arial" w:eastAsia="Arial" w:cs="Arial"/>
       <w:b/>
       <w:bCs/>
-      <w:color w:val="4F81BD" w:themeColor="accent1"/>
+      <w:color w:val="000000"/>
+      <w:sz w:val="24"/>
     </w:rPr>
   </w:style>
   <w:style w:type="paragraph" w:styleId="Title">
@@ -3731,11 +3880,11 @@
       <w:contextualSpacing/>
     </w:pPr>
     <w:rPr>
-      <w:rFonts w:asciiTheme="majorHAnsi" w:eastAsiaTheme="majorEastAsia" w:hAnsiTheme="majorHAnsi" w:cstheme="majorBidi"/>
-      <w:color w:val="17365D" w:themeColor="text2" w:themeShade="BF"/>
+      <w:rFonts w:asciiTheme="majorHAnsi" w:eastAsiaTheme="majorEastAsia" w:hAnsiTheme="majorHAnsi" w:cstheme="majorBidi" w:ascii="Arial" w:hAnsi="Arial" w:eastAsia="Arial" w:cs="Arial"/>
+      <w:color w:val="000000"/>
       <w:spacing w:val="5"/>
       <w:kern w:val="28"/>
-      <w:sz w:val="52"/>
+      <w:sz w:val="24"/>
       <w:szCs w:val="52"/>
     </w:rPr>
   </w:style>
@@ -3746,11 +3895,11 @@
     <w:uiPriority w:val="10"/>
     <w:rsid w:val="00FC693F"/>
     <w:rPr>
-      <w:rFonts w:asciiTheme="majorHAnsi" w:eastAsiaTheme="majorEastAsia" w:hAnsiTheme="majorHAnsi" w:cstheme="majorBidi"/>
-      <w:color w:val="17365D" w:themeColor="text2" w:themeShade="BF"/>
+      <w:rFonts w:asciiTheme="majorHAnsi" w:eastAsiaTheme="majorEastAsia" w:hAnsiTheme="majorHAnsi" w:cstheme="majorBidi" w:ascii="Arial" w:hAnsi="Arial" w:eastAsia="Arial" w:cs="Arial"/>
+      <w:color w:val="000000"/>
       <w:spacing w:val="5"/>
       <w:kern w:val="28"/>
-      <w:sz w:val="52"/>
+      <w:sz w:val="24"/>
       <w:szCs w:val="52"/>
     </w:rPr>
   </w:style>
@@ -3768,10 +3917,10 @@
       </w:numPr>
     </w:pPr>
     <w:rPr>
-      <w:rFonts w:asciiTheme="majorHAnsi" w:eastAsiaTheme="majorEastAsia" w:hAnsiTheme="majorHAnsi" w:cstheme="majorBidi"/>
+      <w:rFonts w:asciiTheme="majorHAnsi" w:eastAsiaTheme="majorEastAsia" w:hAnsiTheme="majorHAnsi" w:cstheme="majorBidi" w:ascii="Arial" w:hAnsi="Arial" w:eastAsia="Arial" w:cs="Arial"/>
       <w:i/>
       <w:iCs/>
-      <w:color w:val="4F81BD" w:themeColor="accent1"/>
+      <w:color w:val="000000"/>
       <w:spacing w:val="15"/>
       <w:sz w:val="24"/>
       <w:szCs w:val="24"/>
@@ -3784,10 +3933,10 @@
     <w:uiPriority w:val="11"/>
     <w:rsid w:val="00FC693F"/>
     <w:rPr>
-      <w:rFonts w:asciiTheme="majorHAnsi" w:eastAsiaTheme="majorEastAsia" w:hAnsiTheme="majorHAnsi" w:cstheme="majorBidi"/>
+      <w:rFonts w:asciiTheme="majorHAnsi" w:eastAsiaTheme="majorEastAsia" w:hAnsiTheme="majorHAnsi" w:cstheme="majorBidi" w:ascii="Arial" w:hAnsi="Arial" w:eastAsia="Arial" w:cs="Arial"/>
       <w:i/>
       <w:iCs/>
-      <w:color w:val="4F81BD" w:themeColor="accent1"/>
+      <w:color w:val="000000"/>
       <w:spacing w:val="15"/>
       <w:sz w:val="24"/>
       <w:szCs w:val="24"/>
@@ -3803,6 +3952,11 @@
       <w:ind w:left="720"/>
       <w:contextualSpacing/>
     </w:pPr>
+    <w:rPr>
+      <w:rFonts w:ascii="Arial" w:hAnsi="Arial" w:eastAsia="Arial" w:cs="Arial"/>
+      <w:color w:val="000000"/>
+      <w:sz w:val="24"/>
+    </w:rPr>
   </w:style>
   <w:style w:type="paragraph" w:styleId="BodyText">
     <w:name w:val="Body Text"/>
@@ -3814,6 +3968,11 @@
     <w:pPr>
       <w:spacing w:after="120"/>
     </w:pPr>
+    <w:rPr>
+      <w:rFonts w:ascii="Arial" w:hAnsi="Arial" w:eastAsia="Arial" w:cs="Arial"/>
+      <w:color w:val="000000"/>
+      <w:sz w:val="24"/>
+    </w:rPr>
   </w:style>
   <w:style w:type="character" w:customStyle="1" w:styleId="BodyTextChar">
     <w:name w:val="Body Text Char"/>
@@ -3821,6 +3980,11 @@
     <w:link w:val="BodyText"/>
     <w:uiPriority w:val="99"/>
     <w:rsid w:val="00AA1D8D"/>
+    <w:rPr>
+      <w:rFonts w:ascii="Arial" w:hAnsi="Arial" w:eastAsia="Arial" w:cs="Arial"/>
+      <w:color w:val="000000"/>
+      <w:sz w:val="24"/>
+    </w:rPr>
   </w:style>
   <w:style w:type="paragraph" w:styleId="BodyText2">
     <w:name w:val="Body Text 2"/>
@@ -3832,6 +3996,11 @@
     <w:pPr>
       <w:spacing w:after="120" w:line="480" w:lineRule="auto"/>
     </w:pPr>
+    <w:rPr>
+      <w:rFonts w:ascii="Arial" w:hAnsi="Arial" w:eastAsia="Arial" w:cs="Arial"/>
+      <w:color w:val="000000"/>
+      <w:sz w:val="24"/>
+    </w:rPr>
   </w:style>
   <w:style w:type="character" w:customStyle="1" w:styleId="BodyText2Char">
     <w:name w:val="Body Text 2 Char"/>
@@ -3839,6 +4008,11 @@
     <w:link w:val="BodyText2"/>
     <w:uiPriority w:val="99"/>
     <w:rsid w:val="00AA1D8D"/>
+    <w:rPr>
+      <w:rFonts w:ascii="Arial" w:hAnsi="Arial" w:eastAsia="Arial" w:cs="Arial"/>
+      <w:color w:val="000000"/>
+      <w:sz w:val="24"/>
+    </w:rPr>
   </w:style>
   <w:style w:type="paragraph" w:styleId="BodyText3">
     <w:name w:val="Body Text 3"/>
@@ -3851,7 +4025,9 @@
       <w:spacing w:after="120"/>
     </w:pPr>
     <w:rPr>
-      <w:sz w:val="16"/>
+      <w:rFonts w:ascii="Arial" w:hAnsi="Arial" w:eastAsia="Arial" w:cs="Arial"/>
+      <w:color w:val="000000"/>
+      <w:sz w:val="24"/>
       <w:szCs w:val="16"/>
     </w:rPr>
   </w:style>
@@ -3862,7 +4038,9 @@
     <w:uiPriority w:val="99"/>
     <w:rsid w:val="00AA1D8D"/>
     <w:rPr>
-      <w:sz w:val="16"/>
+      <w:rFonts w:ascii="Arial" w:hAnsi="Arial" w:eastAsia="Arial" w:cs="Arial"/>
+      <w:color w:val="000000"/>
+      <w:sz w:val="24"/>
       <w:szCs w:val="16"/>
     </w:rPr>
   </w:style>
@@ -3876,6 +4054,11 @@
       <w:ind w:left="360" w:hanging="360"/>
       <w:contextualSpacing/>
     </w:pPr>
+    <w:rPr>
+      <w:rFonts w:ascii="Arial" w:hAnsi="Arial" w:eastAsia="Arial" w:cs="Arial"/>
+      <w:color w:val="000000"/>
+      <w:sz w:val="24"/>
+    </w:rPr>
   </w:style>
   <w:style w:type="paragraph" w:styleId="List2">
     <w:name w:val="List 2"/>
@@ -3887,6 +4070,11 @@
       <w:ind w:left="720" w:hanging="360"/>
       <w:contextualSpacing/>
     </w:pPr>
+    <w:rPr>
+      <w:rFonts w:ascii="Arial" w:hAnsi="Arial" w:eastAsia="Arial" w:cs="Arial"/>
+      <w:color w:val="000000"/>
+      <w:sz w:val="24"/>
+    </w:rPr>
   </w:style>
   <w:style w:type="paragraph" w:styleId="List3">
     <w:name w:val="List 3"/>
@@ -3898,6 +4086,11 @@
       <w:ind w:left="1080" w:hanging="360"/>
       <w:contextualSpacing/>
     </w:pPr>
+    <w:rPr>
+      <w:rFonts w:ascii="Arial" w:hAnsi="Arial" w:eastAsia="Arial" w:cs="Arial"/>
+      <w:color w:val="000000"/>
+      <w:sz w:val="24"/>
+    </w:rPr>
   </w:style>
   <w:style w:type="paragraph" w:styleId="ListBullet">
     <w:name w:val="List Bullet"/>
@@ -3911,6 +4104,11 @@
       </w:numPr>
       <w:contextualSpacing/>
     </w:pPr>
+    <w:rPr>
+      <w:rFonts w:ascii="Arial" w:hAnsi="Arial" w:eastAsia="Arial" w:cs="Arial"/>
+      <w:color w:val="000000"/>
+      <w:sz w:val="24"/>
+    </w:rPr>
   </w:style>
   <w:style w:type="paragraph" w:styleId="ListBullet2">
     <w:name w:val="List Bullet 2"/>
@@ -3924,6 +4122,11 @@
       </w:numPr>
       <w:contextualSpacing/>
     </w:pPr>
+    <w:rPr>
+      <w:rFonts w:ascii="Arial" w:hAnsi="Arial" w:eastAsia="Arial" w:cs="Arial"/>
+      <w:color w:val="000000"/>
+      <w:sz w:val="24"/>
+    </w:rPr>
   </w:style>
   <w:style w:type="paragraph" w:styleId="ListBullet3">
     <w:name w:val="List Bullet 3"/>
@@ -3937,6 +4140,11 @@
       </w:numPr>
       <w:contextualSpacing/>
     </w:pPr>
+    <w:rPr>
+      <w:rFonts w:ascii="Arial" w:hAnsi="Arial" w:eastAsia="Arial" w:cs="Arial"/>
+      <w:color w:val="000000"/>
+      <w:sz w:val="24"/>
+    </w:rPr>
   </w:style>
   <w:style w:type="paragraph" w:styleId="ListNumber">
     <w:name w:val="List Number"/>
@@ -3950,6 +4158,11 @@
       </w:numPr>
       <w:contextualSpacing/>
     </w:pPr>
+    <w:rPr>
+      <w:rFonts w:ascii="Arial" w:hAnsi="Arial" w:eastAsia="Arial" w:cs="Arial"/>
+      <w:color w:val="000000"/>
+      <w:sz w:val="24"/>
+    </w:rPr>
   </w:style>
   <w:style w:type="paragraph" w:styleId="ListNumber2">
     <w:name w:val="List Number 2"/>
@@ -3963,6 +4176,11 @@
       </w:numPr>
       <w:contextualSpacing/>
     </w:pPr>
+    <w:rPr>
+      <w:rFonts w:ascii="Arial" w:hAnsi="Arial" w:eastAsia="Arial" w:cs="Arial"/>
+      <w:color w:val="000000"/>
+      <w:sz w:val="24"/>
+    </w:rPr>
   </w:style>
   <w:style w:type="paragraph" w:styleId="ListNumber3">
     <w:name w:val="List Number 3"/>
@@ -3976,6 +4194,11 @@
       </w:numPr>
       <w:contextualSpacing/>
     </w:pPr>
+    <w:rPr>
+      <w:rFonts w:ascii="Arial" w:hAnsi="Arial" w:eastAsia="Arial" w:cs="Arial"/>
+      <w:color w:val="000000"/>
+      <w:sz w:val="24"/>
+    </w:rPr>
   </w:style>
   <w:style w:type="paragraph" w:styleId="ListContinue">
     <w:name w:val="List Continue"/>
@@ -3988,6 +4211,11 @@
       <w:ind w:left="360"/>
       <w:contextualSpacing/>
     </w:pPr>
+    <w:rPr>
+      <w:rFonts w:ascii="Arial" w:hAnsi="Arial" w:eastAsia="Arial" w:cs="Arial"/>
+      <w:color w:val="000000"/>
+      <w:sz w:val="24"/>
+    </w:rPr>
   </w:style>
   <w:style w:type="paragraph" w:styleId="ListContinue2">
     <w:name w:val="List Continue 2"/>
@@ -4000,6 +4228,11 @@
       <w:ind w:left="720"/>
       <w:contextualSpacing/>
     </w:pPr>
+    <w:rPr>
+      <w:rFonts w:ascii="Arial" w:hAnsi="Arial" w:eastAsia="Arial" w:cs="Arial"/>
+      <w:color w:val="000000"/>
+      <w:sz w:val="24"/>
+    </w:rPr>
   </w:style>
   <w:style w:type="paragraph" w:styleId="ListContinue3">
     <w:name w:val="List Continue 3"/>
@@ -4012,6 +4245,11 @@
       <w:ind w:left="1080"/>
       <w:contextualSpacing/>
     </w:pPr>
+    <w:rPr>
+      <w:rFonts w:ascii="Arial" w:hAnsi="Arial" w:eastAsia="Arial" w:cs="Arial"/>
+      <w:color w:val="000000"/>
+      <w:sz w:val="24"/>
+    </w:rPr>
   </w:style>
   <w:style w:type="paragraph" w:styleId="MacroText">
     <w:name w:val="macro"/>
@@ -4031,8 +4269,9 @@
       </w:tabs>
     </w:pPr>
     <w:rPr>
-      <w:rFonts w:ascii="Courier" w:hAnsi="Courier"/>
-      <w:sz w:val="20"/>
+      <w:rFonts w:ascii="Arial" w:hAnsi="Arial" w:eastAsia="Arial" w:cs="Arial"/>
+      <w:color w:val="000000"/>
+      <w:sz w:val="24"/>
       <w:szCs w:val="20"/>
     </w:rPr>
   </w:style>
@@ -4043,8 +4282,9 @@
     <w:uiPriority w:val="99"/>
     <w:rsid w:val="0029639D"/>
     <w:rPr>
-      <w:rFonts w:ascii="Courier" w:hAnsi="Courier"/>
-      <w:sz w:val="20"/>
+      <w:rFonts w:ascii="Arial" w:hAnsi="Arial" w:eastAsia="Arial" w:cs="Arial"/>
+      <w:color w:val="000000"/>
+      <w:sz w:val="24"/>
       <w:szCs w:val="20"/>
     </w:rPr>
   </w:style>
@@ -4057,9 +4297,11 @@
     <w:qFormat/>
     <w:rsid w:val="00FC693F"/>
     <w:rPr>
+      <w:rFonts w:ascii="Arial" w:hAnsi="Arial" w:eastAsia="Arial" w:cs="Arial"/>
       <w:i/>
       <w:iCs/>
-      <w:color w:val="000000" w:themeColor="text1"/>
+      <w:color w:val="000000"/>
+      <w:sz w:val="24"/>
     </w:rPr>
   </w:style>
   <w:style w:type="character" w:customStyle="1" w:styleId="QuoteChar">
@@ -4069,9 +4311,11 @@
     <w:uiPriority w:val="29"/>
     <w:rsid w:val="00FC693F"/>
     <w:rPr>
+      <w:rFonts w:ascii="Arial" w:hAnsi="Arial" w:eastAsia="Arial" w:cs="Arial"/>
       <w:i/>
       <w:iCs/>
-      <w:color w:val="000000" w:themeColor="text1"/>
+      <w:color w:val="000000"/>
+      <w:sz w:val="24"/>
     </w:rPr>
   </w:style>
   <w:style w:type="character" w:customStyle="1" w:styleId="Heading4Char">
@@ -4082,12 +4326,13 @@
     <w:semiHidden/>
     <w:rsid w:val="00FC693F"/>
     <w:rPr>
-      <w:rFonts w:asciiTheme="majorHAnsi" w:eastAsiaTheme="majorEastAsia" w:hAnsiTheme="majorHAnsi" w:cstheme="majorBidi"/>
+      <w:rFonts w:asciiTheme="majorHAnsi" w:eastAsiaTheme="majorEastAsia" w:hAnsiTheme="majorHAnsi" w:cstheme="majorBidi" w:ascii="Arial" w:hAnsi="Arial" w:eastAsia="Arial" w:cs="Arial"/>
       <w:b/>
       <w:bCs/>
       <w:i/>
       <w:iCs/>
-      <w:color w:val="4F81BD" w:themeColor="accent1"/>
+      <w:color w:val="000000"/>
+      <w:sz w:val="24"/>
     </w:rPr>
   </w:style>
   <w:style w:type="character" w:customStyle="1" w:styleId="Heading5Char">
@@ -4098,8 +4343,9 @@
     <w:semiHidden/>
     <w:rsid w:val="00FC693F"/>
     <w:rPr>
-      <w:rFonts w:asciiTheme="majorHAnsi" w:eastAsiaTheme="majorEastAsia" w:hAnsiTheme="majorHAnsi" w:cstheme="majorBidi"/>
-      <w:color w:val="243F60" w:themeColor="accent1" w:themeShade="7F"/>
+      <w:rFonts w:asciiTheme="majorHAnsi" w:eastAsiaTheme="majorEastAsia" w:hAnsiTheme="majorHAnsi" w:cstheme="majorBidi" w:ascii="Arial" w:hAnsi="Arial" w:eastAsia="Arial" w:cs="Arial"/>
+      <w:color w:val="000000"/>
+      <w:sz w:val="24"/>
     </w:rPr>
   </w:style>
   <w:style w:type="character" w:customStyle="1" w:styleId="Heading6Char">
@@ -4110,10 +4356,11 @@
     <w:semiHidden/>
     <w:rsid w:val="00FC693F"/>
     <w:rPr>
-      <w:rFonts w:asciiTheme="majorHAnsi" w:eastAsiaTheme="majorEastAsia" w:hAnsiTheme="majorHAnsi" w:cstheme="majorBidi"/>
+      <w:rFonts w:asciiTheme="majorHAnsi" w:eastAsiaTheme="majorEastAsia" w:hAnsiTheme="majorHAnsi" w:cstheme="majorBidi" w:ascii="Arial" w:hAnsi="Arial" w:eastAsia="Arial" w:cs="Arial"/>
       <w:i/>
       <w:iCs/>
-      <w:color w:val="243F60" w:themeColor="accent1" w:themeShade="7F"/>
+      <w:color w:val="000000"/>
+      <w:sz w:val="24"/>
     </w:rPr>
   </w:style>
   <w:style w:type="character" w:customStyle="1" w:styleId="Heading7Char">
@@ -4124,10 +4371,11 @@
     <w:semiHidden/>
     <w:rsid w:val="00FC693F"/>
     <w:rPr>
-      <w:rFonts w:asciiTheme="majorHAnsi" w:eastAsiaTheme="majorEastAsia" w:hAnsiTheme="majorHAnsi" w:cstheme="majorBidi"/>
+      <w:rFonts w:asciiTheme="majorHAnsi" w:eastAsiaTheme="majorEastAsia" w:hAnsiTheme="majorHAnsi" w:cstheme="majorBidi" w:ascii="Arial" w:hAnsi="Arial" w:eastAsia="Arial" w:cs="Arial"/>
       <w:i/>
       <w:iCs/>
-      <w:color w:val="404040" w:themeColor="text1" w:themeTint="BF"/>
+      <w:color w:val="000000"/>
+      <w:sz w:val="24"/>
     </w:rPr>
   </w:style>
   <w:style w:type="character" w:customStyle="1" w:styleId="Heading8Char">
@@ -4138,9 +4386,9 @@
     <w:semiHidden/>
     <w:rsid w:val="00FC693F"/>
     <w:rPr>
-      <w:rFonts w:asciiTheme="majorHAnsi" w:eastAsiaTheme="majorEastAsia" w:hAnsiTheme="majorHAnsi" w:cstheme="majorBidi"/>
-      <w:color w:val="4F81BD" w:themeColor="accent1"/>
-      <w:sz w:val="20"/>
+      <w:rFonts w:asciiTheme="majorHAnsi" w:eastAsiaTheme="majorEastAsia" w:hAnsiTheme="majorHAnsi" w:cstheme="majorBidi" w:ascii="Arial" w:hAnsi="Arial" w:eastAsia="Arial" w:cs="Arial"/>
+      <w:color w:val="000000"/>
+      <w:sz w:val="24"/>
       <w:szCs w:val="20"/>
     </w:rPr>
   </w:style>
@@ -4152,11 +4400,11 @@
     <w:semiHidden/>
     <w:rsid w:val="00FC693F"/>
     <w:rPr>
-      <w:rFonts w:asciiTheme="majorHAnsi" w:eastAsiaTheme="majorEastAsia" w:hAnsiTheme="majorHAnsi" w:cstheme="majorBidi"/>
+      <w:rFonts w:asciiTheme="majorHAnsi" w:eastAsiaTheme="majorEastAsia" w:hAnsiTheme="majorHAnsi" w:cstheme="majorBidi" w:ascii="Arial" w:hAnsi="Arial" w:eastAsia="Arial" w:cs="Arial"/>
       <w:i/>
       <w:iCs/>
-      <w:color w:val="404040" w:themeColor="text1" w:themeTint="BF"/>
-      <w:sz w:val="20"/>
+      <w:color w:val="000000"/>
+      <w:sz w:val="24"/>
       <w:szCs w:val="20"/>
     </w:rPr>
   </w:style>
@@ -4173,10 +4421,11 @@
       <w:spacing w:line="240" w:lineRule="auto"/>
     </w:pPr>
     <w:rPr>
+      <w:rFonts w:ascii="Arial" w:hAnsi="Arial" w:eastAsia="Arial" w:cs="Arial"/>
       <w:b/>
       <w:bCs/>
-      <w:color w:val="4F81BD" w:themeColor="accent1"/>
-      <w:sz w:val="18"/>
+      <w:color w:val="000000"/>
+      <w:sz w:val="24"/>
       <w:szCs w:val="18"/>
     </w:rPr>
   </w:style>
@@ -4187,8 +4436,11 @@
     <w:qFormat/>
     <w:rsid w:val="00FC693F"/>
     <w:rPr>
+      <w:rFonts w:ascii="Arial" w:hAnsi="Arial" w:eastAsia="Arial" w:cs="Arial"/>
       <w:b/>
       <w:bCs/>
+      <w:color w:val="000000"/>
+      <w:sz w:val="24"/>
     </w:rPr>
   </w:style>
   <w:style w:type="character" w:styleId="Emphasis">
@@ -4198,8 +4450,11 @@
     <w:qFormat/>
     <w:rsid w:val="00FC693F"/>
     <w:rPr>
+      <w:rFonts w:ascii="Arial" w:hAnsi="Arial" w:eastAsia="Arial" w:cs="Arial"/>
       <w:i/>
       <w:iCs/>
+      <w:color w:val="000000"/>
+      <w:sz w:val="24"/>
     </w:rPr>
   </w:style>
   <w:style w:type="paragraph" w:styleId="IntenseQuote">
@@ -4218,11 +4473,13 @@
       <w:ind w:left="936" w:right="936"/>
     </w:pPr>
     <w:rPr>
+      <w:rFonts w:ascii="Arial" w:hAnsi="Arial" w:eastAsia="Arial" w:cs="Arial"/>
       <w:b/>
       <w:bCs/>
       <w:i/>
       <w:iCs/>
-      <w:color w:val="4F81BD" w:themeColor="accent1"/>
+      <w:color w:val="000000"/>
+      <w:sz w:val="24"/>
     </w:rPr>
   </w:style>
   <w:style w:type="character" w:customStyle="1" w:styleId="IntenseQuoteChar">
@@ -4232,11 +4489,13 @@
     <w:uiPriority w:val="30"/>
     <w:rsid w:val="00FC693F"/>
     <w:rPr>
+      <w:rFonts w:ascii="Arial" w:hAnsi="Arial" w:eastAsia="Arial" w:cs="Arial"/>
       <w:b/>
       <w:bCs/>
       <w:i/>
       <w:iCs/>
-      <w:color w:val="4F81BD" w:themeColor="accent1"/>
+      <w:color w:val="000000"/>
+      <w:sz w:val="24"/>
     </w:rPr>
   </w:style>
   <w:style w:type="character" w:styleId="SubtleEmphasis">
@@ -4246,9 +4505,11 @@
     <w:qFormat/>
     <w:rsid w:val="00FC693F"/>
     <w:rPr>
+      <w:rFonts w:ascii="Arial" w:hAnsi="Arial" w:eastAsia="Arial" w:cs="Arial"/>
       <w:i/>
       <w:iCs/>
-      <w:color w:val="808080" w:themeColor="text1" w:themeTint="7F"/>
+      <w:color w:val="000000"/>
+      <w:sz w:val="24"/>
     </w:rPr>
   </w:style>
   <w:style w:type="character" w:styleId="IntenseEmphasis">
@@ -4258,11 +4519,13 @@
     <w:qFormat/>
     <w:rsid w:val="00FC693F"/>
     <w:rPr>
+      <w:rFonts w:ascii="Arial" w:hAnsi="Arial" w:eastAsia="Arial" w:cs="Arial"/>
       <w:b/>
       <w:bCs/>
       <w:i/>
       <w:iCs/>
-      <w:color w:val="4F81BD" w:themeColor="accent1"/>
+      <w:color w:val="000000"/>
+      <w:sz w:val="24"/>
     </w:rPr>
   </w:style>
   <w:style w:type="character" w:styleId="SubtleReference">
@@ -4272,8 +4535,10 @@
     <w:qFormat/>
     <w:rsid w:val="00FC693F"/>
     <w:rPr>
+      <w:rFonts w:ascii="Arial" w:hAnsi="Arial" w:eastAsia="Arial" w:cs="Arial"/>
       <w:smallCaps/>
-      <w:color w:val="C0504D" w:themeColor="accent2"/>
+      <w:color w:val="000000"/>
+      <w:sz w:val="24"/>
       <w:u w:val="single"/>
     </w:rPr>
   </w:style>
@@ -4284,11 +4549,13 @@
     <w:qFormat/>
     <w:rsid w:val="00FC693F"/>
     <w:rPr>
+      <w:rFonts w:ascii="Arial" w:hAnsi="Arial" w:eastAsia="Arial" w:cs="Arial"/>
       <w:b/>
       <w:bCs/>
       <w:smallCaps/>
-      <w:color w:val="C0504D" w:themeColor="accent2"/>
+      <w:color w:val="000000"/>
       <w:spacing w:val="5"/>
+      <w:sz w:val="24"/>
       <w:u w:val="single"/>
     </w:rPr>
   </w:style>
@@ -4299,10 +4566,13 @@
     <w:qFormat/>
     <w:rsid w:val="00FC693F"/>
     <w:rPr>
+      <w:rFonts w:ascii="Arial" w:hAnsi="Arial" w:eastAsia="Arial" w:cs="Arial"/>
       <w:b/>
       <w:bCs/>
       <w:smallCaps/>
+      <w:color w:val="000000"/>
       <w:spacing w:val="5"/>
+      <w:sz w:val="24"/>
     </w:rPr>
   </w:style>
   <w:style w:type="paragraph" w:styleId="TOCHeading">
@@ -4317,6 +4587,11 @@
     <w:pPr>
       <w:outlineLvl w:val="9"/>
     </w:pPr>
+    <w:rPr>
+      <w:rFonts w:ascii="Arial" w:hAnsi="Arial" w:eastAsia="Arial" w:cs="Arial"/>
+      <w:color w:val="000000"/>
+      <w:sz w:val="24"/>
+    </w:rPr>
   </w:style>
   <w:style w:type="table" w:styleId="TableGrid">
     <w:name w:val="Table Grid"/>

</xml_diff>

<commit_message>
Adicionar vídeo da apresentação aos entregáveis (#11)
Co-authored-by: Antonio Silva <184320896+acsilv@users.noreply.github.com>
</commit_message>
<xml_diff>
--- a/relatorios/finais/relatorio-pratico-pedidos-veloz.docx
+++ b/relatorios/finais/relatorio-pratico-pedidos-veloz.docx
@@ -84,12 +84,10 @@
       <w:r>
         <w:rPr>
           <w:rFonts w:ascii="Arial" w:hAnsi="Arial" w:eastAsia="Arial" w:cs="Arial"/>
-          <w:b w:val="0"/>
-          <w:i w:val="0"/>
           <w:color w:val="000000"/>
           <w:sz w:val="24"/>
         </w:rPr>
-        <w:t>Vídeo: link será inserido após a gravação</w:t>
+        <w:t>Vídeo da apresentação: https://youtu.be/uwSEwUH-t7k</w:t>
       </w:r>
     </w:p>
     <w:p>
@@ -97,6 +95,12 @@
         <w:pStyle w:val="Heading1"/>
       </w:pPr>
       <w:r>
+        <w:rPr>
+          <w:rFonts w:ascii="Arial" w:hAnsi="Arial" w:eastAsia="Arial" w:cs="Arial"/>
+          <w:b/>
+          <w:color w:val="000000"/>
+          <w:sz w:val="24"/>
+        </w:rPr>
         <w:t>Visão geral da solução</w:t>
       </w:r>
     </w:p>
@@ -136,7 +140,7 @@
         <w:tc>
           <w:tcPr>
             <w:tcW w:type="dxa" w:w="1800"/>
-            <w:shd w:fill="F2F4F7"/>
+            <w:shd w:fill="FFFFFF" w:color="auto"/>
             <w:tcMar>
               <w:top w:w="80" w:type="dxa"/>
               <w:bottom w:w="80" w:type="dxa"/>
@@ -164,7 +168,7 @@
         <w:tc>
           <w:tcPr>
             <w:tcW w:type="dxa" w:w="2300"/>
-            <w:shd w:fill="F2F4F7"/>
+            <w:shd w:fill="FFFFFF" w:color="auto"/>
             <w:tcMar>
               <w:top w:w="80" w:type="dxa"/>
               <w:bottom w:w="80" w:type="dxa"/>
@@ -192,7 +196,7 @@
         <w:tc>
           <w:tcPr>
             <w:tcW w:type="dxa" w:w="5260"/>
-            <w:shd w:fill="F2F4F7"/>
+            <w:shd w:fill="FFFFFF" w:color="auto"/>
             <w:tcMar>
               <w:top w:w="80" w:type="dxa"/>
               <w:bottom w:w="80" w:type="dxa"/>
@@ -561,6 +565,12 @@
         <w:pStyle w:val="Heading2"/>
       </w:pPr>
       <w:r>
+        <w:rPr>
+          <w:rFonts w:ascii="Arial" w:hAnsi="Arial" w:eastAsia="Arial" w:cs="Arial"/>
+          <w:b/>
+          <w:color w:val="000000"/>
+          <w:sz w:val="24"/>
+        </w:rPr>
         <w:t>Contrato assíncrono</w:t>
       </w:r>
     </w:p>
@@ -598,6 +608,11 @@
     </w:p>
     <w:p>
       <w:r>
+        <w:rPr>
+          <w:rFonts w:ascii="Arial" w:hAnsi="Arial" w:eastAsia="Arial" w:cs="Arial"/>
+          <w:color w:val="000000"/>
+          <w:sz w:val="24"/>
+        </w:rPr>
         <w:br w:type="page"/>
       </w:r>
     </w:p>
@@ -606,6 +621,12 @@
         <w:pStyle w:val="Heading1"/>
       </w:pPr>
       <w:r>
+        <w:rPr>
+          <w:rFonts w:ascii="Arial" w:hAnsi="Arial" w:eastAsia="Arial" w:cs="Arial"/>
+          <w:b/>
+          <w:color w:val="000000"/>
+          <w:sz w:val="24"/>
+        </w:rPr>
         <w:t>Ambiente local e conteinerização</w:t>
       </w:r>
     </w:p>
@@ -646,6 +667,12 @@
         <w:pStyle w:val="Heading2"/>
       </w:pPr>
       <w:r>
+        <w:rPr>
+          <w:rFonts w:ascii="Arial" w:hAnsi="Arial" w:eastAsia="Arial" w:cs="Arial"/>
+          <w:b/>
+          <w:color w:val="000000"/>
+          <w:sz w:val="24"/>
+        </w:rPr>
         <w:t>Execução local</w:t>
       </w:r>
     </w:p>
@@ -685,7 +712,7 @@
         <w:tc>
           <w:tcPr>
             <w:tcW w:type="dxa" w:w="1900"/>
-            <w:shd w:fill="F2F4F7"/>
+            <w:shd w:fill="FFFFFF" w:color="auto"/>
             <w:tcMar>
               <w:top w:w="80" w:type="dxa"/>
               <w:bottom w:w="80" w:type="dxa"/>
@@ -713,7 +740,7 @@
         <w:tc>
           <w:tcPr>
             <w:tcW w:type="dxa" w:w="2500"/>
-            <w:shd w:fill="F2F4F7"/>
+            <w:shd w:fill="FFFFFF" w:color="auto"/>
             <w:tcMar>
               <w:top w:w="80" w:type="dxa"/>
               <w:bottom w:w="80" w:type="dxa"/>
@@ -741,7 +768,7 @@
         <w:tc>
           <w:tcPr>
             <w:tcW w:type="dxa" w:w="4960"/>
-            <w:shd w:fill="F2F4F7"/>
+            <w:shd w:fill="FFFFFF" w:color="auto"/>
             <w:tcMar>
               <w:top w:w="80" w:type="dxa"/>
               <w:bottom w:w="80" w:type="dxa"/>
@@ -1123,6 +1150,11 @@
     </w:p>
     <w:p>
       <w:r>
+        <w:rPr>
+          <w:rFonts w:ascii="Arial" w:hAnsi="Arial" w:eastAsia="Arial" w:cs="Arial"/>
+          <w:color w:val="000000"/>
+          <w:sz w:val="24"/>
+        </w:rPr>
         <w:br w:type="page"/>
       </w:r>
     </w:p>
@@ -1131,6 +1163,12 @@
         <w:pStyle w:val="Heading1"/>
       </w:pPr>
       <w:r>
+        <w:rPr>
+          <w:rFonts w:ascii="Arial" w:hAnsi="Arial" w:eastAsia="Arial" w:cs="Arial"/>
+          <w:b/>
+          <w:color w:val="000000"/>
+          <w:sz w:val="24"/>
+        </w:rPr>
         <w:t>Kubernetes: configuração entregue</w:t>
       </w:r>
     </w:p>
@@ -1171,6 +1209,12 @@
         <w:pStyle w:val="Heading2"/>
       </w:pPr>
       <w:r>
+        <w:rPr>
+          <w:rFonts w:ascii="Arial" w:hAnsi="Arial" w:eastAsia="Arial" w:cs="Arial"/>
+          <w:b/>
+          <w:color w:val="000000"/>
+          <w:sz w:val="24"/>
+        </w:rPr>
         <w:t>Configuração e segurança</w:t>
       </w:r>
     </w:p>
@@ -1209,7 +1253,7 @@
         <w:tc>
           <w:tcPr>
             <w:tcW w:type="dxa" w:w="2300"/>
-            <w:shd w:fill="F2F4F7"/>
+            <w:shd w:fill="FFFFFF" w:color="auto"/>
             <w:tcMar>
               <w:top w:w="80" w:type="dxa"/>
               <w:bottom w:w="80" w:type="dxa"/>
@@ -1237,7 +1281,7 @@
         <w:tc>
           <w:tcPr>
             <w:tcW w:type="dxa" w:w="7060"/>
-            <w:shd w:fill="F2F4F7"/>
+            <w:shd w:fill="FFFFFF" w:color="auto"/>
             <w:tcMar>
               <w:top w:w="80" w:type="dxa"/>
               <w:bottom w:w="80" w:type="dxa"/>
@@ -1567,6 +1611,11 @@
     </w:p>
     <w:p>
       <w:r>
+        <w:rPr>
+          <w:rFonts w:ascii="Arial" w:hAnsi="Arial" w:eastAsia="Arial" w:cs="Arial"/>
+          <w:color w:val="000000"/>
+          <w:sz w:val="24"/>
+        </w:rPr>
         <w:br w:type="page"/>
       </w:r>
     </w:p>
@@ -1575,6 +1624,12 @@
         <w:pStyle w:val="Heading1"/>
       </w:pPr>
       <w:r>
+        <w:rPr>
+          <w:rFonts w:ascii="Arial" w:hAnsi="Arial" w:eastAsia="Arial" w:cs="Arial"/>
+          <w:b/>
+          <w:color w:val="000000"/>
+          <w:sz w:val="24"/>
+        </w:rPr>
         <w:t>CI/CD, imagens e GitHub</w:t>
       </w:r>
     </w:p>
@@ -1615,6 +1670,12 @@
         <w:pStyle w:val="Heading2"/>
       </w:pPr>
       <w:r>
+        <w:rPr>
+          <w:rFonts w:ascii="Arial" w:hAnsi="Arial" w:eastAsia="Arial" w:cs="Arial"/>
+          <w:b/>
+          <w:color w:val="000000"/>
+          <w:sz w:val="24"/>
+        </w:rPr>
         <w:t>Deploy protegido e rollback</w:t>
       </w:r>
     </w:p>
@@ -1639,6 +1700,12 @@
         <w:pStyle w:val="Heading2"/>
       </w:pPr>
       <w:r>
+        <w:rPr>
+          <w:rFonts w:ascii="Arial" w:hAnsi="Arial" w:eastAsia="Arial" w:cs="Arial"/>
+          <w:b/>
+          <w:color w:val="000000"/>
+          <w:sz w:val="24"/>
+        </w:rPr>
         <w:t>Infraestrutura como código</w:t>
       </w:r>
     </w:p>
@@ -1677,7 +1744,7 @@
         <w:tc>
           <w:tcPr>
             <w:tcW w:type="dxa" w:w="2300"/>
-            <w:shd w:fill="F2F4F7"/>
+            <w:shd w:fill="FFFFFF" w:color="auto"/>
             <w:tcMar>
               <w:top w:w="80" w:type="dxa"/>
               <w:bottom w:w="80" w:type="dxa"/>
@@ -1705,7 +1772,7 @@
         <w:tc>
           <w:tcPr>
             <w:tcW w:type="dxa" w:w="7060"/>
-            <w:shd w:fill="F2F4F7"/>
+            <w:shd w:fill="FFFFFF" w:color="auto"/>
             <w:tcMar>
               <w:top w:w="80" w:type="dxa"/>
               <w:bottom w:w="80" w:type="dxa"/>
@@ -1907,6 +1974,11 @@
     </w:p>
     <w:p>
       <w:r>
+        <w:rPr>
+          <w:rFonts w:ascii="Arial" w:hAnsi="Arial" w:eastAsia="Arial" w:cs="Arial"/>
+          <w:color w:val="000000"/>
+          <w:sz w:val="24"/>
+        </w:rPr>
         <w:br w:type="page"/>
       </w:r>
     </w:p>
@@ -1915,6 +1987,12 @@
         <w:pStyle w:val="Heading1"/>
       </w:pPr>
       <w:r>
+        <w:rPr>
+          <w:rFonts w:ascii="Arial" w:hAnsi="Arial" w:eastAsia="Arial" w:cs="Arial"/>
+          <w:b/>
+          <w:color w:val="000000"/>
+          <w:sz w:val="24"/>
+        </w:rPr>
         <w:t>Observabilidade e resiliência</w:t>
       </w:r>
     </w:p>
@@ -1955,6 +2033,12 @@
         <w:pStyle w:val="Heading2"/>
       </w:pPr>
       <w:r>
+        <w:rPr>
+          <w:rFonts w:ascii="Arial" w:hAnsi="Arial" w:eastAsia="Arial" w:cs="Arial"/>
+          <w:b/>
+          <w:color w:val="000000"/>
+          <w:sz w:val="24"/>
+        </w:rPr>
         <w:t>Validações executadas</w:t>
       </w:r>
     </w:p>
@@ -1977,7 +2061,7 @@
         <w:tc>
           <w:tcPr>
             <w:tcW w:type="dxa" w:w="2700"/>
-            <w:shd w:fill="F2F4F7"/>
+            <w:shd w:fill="FFFFFF" w:color="auto"/>
             <w:tcMar>
               <w:top w:w="80" w:type="dxa"/>
               <w:bottom w:w="80" w:type="dxa"/>
@@ -2005,7 +2089,7 @@
         <w:tc>
           <w:tcPr>
             <w:tcW w:type="dxa" w:w="6660"/>
-            <w:shd w:fill="F2F4F7"/>
+            <w:shd w:fill="FFFFFF" w:color="auto"/>
             <w:tcMar>
               <w:top w:w="80" w:type="dxa"/>
               <w:bottom w:w="80" w:type="dxa"/>
@@ -2394,6 +2478,12 @@
         <w:pStyle w:val="Heading2"/>
       </w:pPr>
       <w:r>
+        <w:rPr>
+          <w:rFonts w:ascii="Arial" w:hAnsi="Arial" w:eastAsia="Arial" w:cs="Arial"/>
+          <w:b/>
+          <w:color w:val="000000"/>
+          <w:sz w:val="24"/>
+        </w:rPr>
         <w:t>Riscos remanescentes</w:t>
       </w:r>
     </w:p>
@@ -2415,6 +2505,11 @@
     </w:p>
     <w:p>
       <w:r>
+        <w:rPr>
+          <w:rFonts w:ascii="Arial" w:hAnsi="Arial" w:eastAsia="Arial" w:cs="Arial"/>
+          <w:color w:val="000000"/>
+          <w:sz w:val="24"/>
+        </w:rPr>
         <w:br w:type="page"/>
       </w:r>
     </w:p>
@@ -2423,6 +2518,12 @@
         <w:pStyle w:val="Heading1"/>
       </w:pPr>
       <w:r>
+        <w:rPr>
+          <w:rFonts w:ascii="Arial" w:hAnsi="Arial" w:eastAsia="Arial" w:cs="Arial"/>
+          <w:b/>
+          <w:color w:val="000000"/>
+          <w:sz w:val="24"/>
+        </w:rPr>
         <w:t>Estado atual do projeto</w:t>
       </w:r>
     </w:p>
@@ -2477,7 +2578,7 @@
         <w:tc>
           <w:tcPr>
             <w:tcW w:type="dxa" w:w="2500"/>
-            <w:shd w:fill="F2F4F7"/>
+            <w:shd w:fill="FFFFFF" w:color="auto"/>
             <w:tcMar>
               <w:top w:w="80" w:type="dxa"/>
               <w:bottom w:w="80" w:type="dxa"/>
@@ -2505,7 +2606,7 @@
         <w:tc>
           <w:tcPr>
             <w:tcW w:type="dxa" w:w="6860"/>
-            <w:shd w:fill="F2F4F7"/>
+            <w:shd w:fill="FFFFFF" w:color="auto"/>
             <w:tcMar>
               <w:top w:w="80" w:type="dxa"/>
               <w:bottom w:w="80" w:type="dxa"/>
@@ -2822,6 +2923,12 @@
         <w:pStyle w:val="Heading2"/>
       </w:pPr>
       <w:r>
+        <w:rPr>
+          <w:rFonts w:ascii="Arial" w:hAnsi="Arial" w:eastAsia="Arial" w:cs="Arial"/>
+          <w:b/>
+          <w:color w:val="000000"/>
+          <w:sz w:val="24"/>
+        </w:rPr>
         <w:t>Conclusão</w:t>
       </w:r>
     </w:p>
@@ -2846,6 +2953,12 @@
         <w:pStyle w:val="Heading2"/>
       </w:pPr>
       <w:r>
+        <w:rPr>
+          <w:rFonts w:ascii="Arial" w:hAnsi="Arial" w:eastAsia="Arial" w:cs="Arial"/>
+          <w:b/>
+          <w:color w:val="000000"/>
+          <w:sz w:val="24"/>
+        </w:rPr>
         <w:t>Referências essenciais</w:t>
       </w:r>
     </w:p>
@@ -3379,6 +3492,7 @@
     </w:pPr>
     <w:rPr>
       <w:rFonts w:ascii="Arial" w:hAnsi="Arial" w:eastAsia="Arial" w:cs="Arial"/>
+      <w:color w:val="000000"/>
       <w:sz w:val="24"/>
     </w:rPr>
   </w:style>
@@ -3396,6 +3510,11 @@
       </w:tabs>
       <w:spacing w:after="0" w:line="240" w:lineRule="auto"/>
     </w:pPr>
+    <w:rPr>
+      <w:rFonts w:ascii="Arial" w:hAnsi="Arial" w:eastAsia="Arial" w:cs="Arial"/>
+      <w:color w:val="000000"/>
+      <w:sz w:val="24"/>
+    </w:rPr>
   </w:style>
   <w:style w:type="character" w:customStyle="1" w:styleId="HeaderChar">
     <w:name w:val="Header Char"/>
@@ -3403,6 +3522,11 @@
     <w:link w:val="Header"/>
     <w:uiPriority w:val="99"/>
     <w:rsid w:val="00E618BF"/>
+    <w:rPr>
+      <w:rFonts w:ascii="Arial" w:hAnsi="Arial" w:eastAsia="Arial" w:cs="Arial"/>
+      <w:color w:val="000000"/>
+      <w:sz w:val="24"/>
+    </w:rPr>
   </w:style>
   <w:style w:type="paragraph" w:styleId="Footer">
     <w:name w:val="footer"/>
@@ -3418,6 +3542,11 @@
       </w:tabs>
       <w:spacing w:after="0" w:line="240" w:lineRule="auto"/>
     </w:pPr>
+    <w:rPr>
+      <w:rFonts w:ascii="Arial" w:hAnsi="Arial" w:eastAsia="Arial" w:cs="Arial"/>
+      <w:color w:val="000000"/>
+      <w:sz w:val="24"/>
+    </w:rPr>
   </w:style>
   <w:style w:type="character" w:customStyle="1" w:styleId="FooterChar">
     <w:name w:val="Footer Char"/>
@@ -3425,6 +3554,11 @@
     <w:link w:val="Footer"/>
     <w:uiPriority w:val="99"/>
     <w:rsid w:val="00E618BF"/>
+    <w:rPr>
+      <w:rFonts w:ascii="Arial" w:hAnsi="Arial" w:eastAsia="Arial" w:cs="Arial"/>
+      <w:color w:val="000000"/>
+      <w:sz w:val="24"/>
+    </w:rPr>
   </w:style>
   <w:style w:type="paragraph" w:styleId="Heading1">
     <w:name w:val="heading 1"/>
@@ -3513,12 +3647,13 @@
       <w:outlineLvl w:val="3"/>
     </w:pPr>
     <w:rPr>
-      <w:rFonts w:asciiTheme="majorHAnsi" w:eastAsiaTheme="majorEastAsia" w:hAnsiTheme="majorHAnsi" w:cstheme="majorBidi"/>
+      <w:rFonts w:asciiTheme="majorHAnsi" w:eastAsiaTheme="majorEastAsia" w:hAnsiTheme="majorHAnsi" w:cstheme="majorBidi" w:ascii="Arial" w:hAnsi="Arial" w:eastAsia="Arial" w:cs="Arial"/>
       <w:b/>
       <w:bCs/>
       <w:i/>
       <w:iCs/>
-      <w:color w:val="4F81BD" w:themeColor="accent1"/>
+      <w:color w:val="000000"/>
+      <w:sz w:val="24"/>
     </w:rPr>
   </w:style>
   <w:style w:type="paragraph" w:styleId="Heading5">
@@ -3538,8 +3673,9 @@
       <w:outlineLvl w:val="4"/>
     </w:pPr>
     <w:rPr>
-      <w:rFonts w:asciiTheme="majorHAnsi" w:eastAsiaTheme="majorEastAsia" w:hAnsiTheme="majorHAnsi" w:cstheme="majorBidi"/>
-      <w:color w:val="243F60" w:themeColor="accent1" w:themeShade="7F"/>
+      <w:rFonts w:asciiTheme="majorHAnsi" w:eastAsiaTheme="majorEastAsia" w:hAnsiTheme="majorHAnsi" w:cstheme="majorBidi" w:ascii="Arial" w:hAnsi="Arial" w:eastAsia="Arial" w:cs="Arial"/>
+      <w:color w:val="000000"/>
+      <w:sz w:val="24"/>
     </w:rPr>
   </w:style>
   <w:style w:type="paragraph" w:styleId="Heading6">
@@ -3559,10 +3695,11 @@
       <w:outlineLvl w:val="5"/>
     </w:pPr>
     <w:rPr>
-      <w:rFonts w:asciiTheme="majorHAnsi" w:eastAsiaTheme="majorEastAsia" w:hAnsiTheme="majorHAnsi" w:cstheme="majorBidi"/>
+      <w:rFonts w:asciiTheme="majorHAnsi" w:eastAsiaTheme="majorEastAsia" w:hAnsiTheme="majorHAnsi" w:cstheme="majorBidi" w:ascii="Arial" w:hAnsi="Arial" w:eastAsia="Arial" w:cs="Arial"/>
       <w:i/>
       <w:iCs/>
-      <w:color w:val="243F60" w:themeColor="accent1" w:themeShade="7F"/>
+      <w:color w:val="000000"/>
+      <w:sz w:val="24"/>
     </w:rPr>
   </w:style>
   <w:style w:type="paragraph" w:styleId="Heading7">
@@ -3582,10 +3719,11 @@
       <w:outlineLvl w:val="6"/>
     </w:pPr>
     <w:rPr>
-      <w:rFonts w:asciiTheme="majorHAnsi" w:eastAsiaTheme="majorEastAsia" w:hAnsiTheme="majorHAnsi" w:cstheme="majorBidi"/>
+      <w:rFonts w:asciiTheme="majorHAnsi" w:eastAsiaTheme="majorEastAsia" w:hAnsiTheme="majorHAnsi" w:cstheme="majorBidi" w:ascii="Arial" w:hAnsi="Arial" w:eastAsia="Arial" w:cs="Arial"/>
       <w:i/>
       <w:iCs/>
-      <w:color w:val="404040" w:themeColor="text1" w:themeTint="BF"/>
+      <w:color w:val="000000"/>
+      <w:sz w:val="24"/>
     </w:rPr>
   </w:style>
   <w:style w:type="paragraph" w:styleId="Heading8">
@@ -3605,9 +3743,9 @@
       <w:outlineLvl w:val="7"/>
     </w:pPr>
     <w:rPr>
-      <w:rFonts w:asciiTheme="majorHAnsi" w:eastAsiaTheme="majorEastAsia" w:hAnsiTheme="majorHAnsi" w:cstheme="majorBidi"/>
-      <w:color w:val="4F81BD" w:themeColor="accent1"/>
-      <w:sz w:val="20"/>
+      <w:rFonts w:asciiTheme="majorHAnsi" w:eastAsiaTheme="majorEastAsia" w:hAnsiTheme="majorHAnsi" w:cstheme="majorBidi" w:ascii="Arial" w:hAnsi="Arial" w:eastAsia="Arial" w:cs="Arial"/>
+      <w:color w:val="000000"/>
+      <w:sz w:val="24"/>
       <w:szCs w:val="20"/>
     </w:rPr>
   </w:style>
@@ -3628,11 +3766,11 @@
       <w:outlineLvl w:val="8"/>
     </w:pPr>
     <w:rPr>
-      <w:rFonts w:asciiTheme="majorHAnsi" w:eastAsiaTheme="majorEastAsia" w:hAnsiTheme="majorHAnsi" w:cstheme="majorBidi"/>
+      <w:rFonts w:asciiTheme="majorHAnsi" w:eastAsiaTheme="majorEastAsia" w:hAnsiTheme="majorHAnsi" w:cstheme="majorBidi" w:ascii="Arial" w:hAnsi="Arial" w:eastAsia="Arial" w:cs="Arial"/>
       <w:i/>
       <w:iCs/>
-      <w:color w:val="404040" w:themeColor="text1" w:themeTint="BF"/>
-      <w:sz w:val="20"/>
+      <w:color w:val="000000"/>
+      <w:sz w:val="24"/>
       <w:szCs w:val="20"/>
     </w:rPr>
   </w:style>
@@ -3641,6 +3779,11 @@
     <w:uiPriority w:val="1"/>
     <w:semiHidden/>
     <w:unhideWhenUsed/>
+    <w:rPr>
+      <w:rFonts w:ascii="Arial" w:hAnsi="Arial" w:eastAsia="Arial" w:cs="Arial"/>
+      <w:color w:val="000000"/>
+      <w:sz w:val="24"/>
+    </w:rPr>
   </w:style>
   <w:style w:type="table" w:default="1" w:styleId="TableNormal">
     <w:name w:val="Normal Table"/>
@@ -3671,6 +3814,11 @@
     <w:pPr>
       <w:spacing w:after="0" w:line="240" w:lineRule="auto"/>
     </w:pPr>
+    <w:rPr>
+      <w:rFonts w:ascii="Arial" w:hAnsi="Arial" w:eastAsia="Arial" w:cs="Arial"/>
+      <w:color w:val="000000"/>
+      <w:sz w:val="24"/>
+    </w:rPr>
   </w:style>
   <w:style w:type="character" w:customStyle="1" w:styleId="Heading1Char">
     <w:name w:val="Heading 1 Char"/>
@@ -3679,11 +3827,11 @@
     <w:uiPriority w:val="9"/>
     <w:rsid w:val="00FC693F"/>
     <w:rPr>
-      <w:rFonts w:asciiTheme="majorHAnsi" w:eastAsiaTheme="majorEastAsia" w:hAnsiTheme="majorHAnsi" w:cstheme="majorBidi"/>
+      <w:rFonts w:asciiTheme="majorHAnsi" w:eastAsiaTheme="majorEastAsia" w:hAnsiTheme="majorHAnsi" w:cstheme="majorBidi" w:ascii="Arial" w:hAnsi="Arial" w:eastAsia="Arial" w:cs="Arial"/>
       <w:b/>
       <w:bCs/>
-      <w:color w:val="365F91" w:themeColor="accent1" w:themeShade="BF"/>
-      <w:sz w:val="28"/>
+      <w:color w:val="000000"/>
+      <w:sz w:val="24"/>
       <w:szCs w:val="28"/>
     </w:rPr>
   </w:style>
@@ -3694,11 +3842,11 @@
     <w:uiPriority w:val="9"/>
     <w:rsid w:val="00FC693F"/>
     <w:rPr>
-      <w:rFonts w:asciiTheme="majorHAnsi" w:eastAsiaTheme="majorEastAsia" w:hAnsiTheme="majorHAnsi" w:cstheme="majorBidi"/>
+      <w:rFonts w:asciiTheme="majorHAnsi" w:eastAsiaTheme="majorEastAsia" w:hAnsiTheme="majorHAnsi" w:cstheme="majorBidi" w:ascii="Arial" w:hAnsi="Arial" w:eastAsia="Arial" w:cs="Arial"/>
       <w:b/>
       <w:bCs/>
-      <w:color w:val="4F81BD" w:themeColor="accent1"/>
-      <w:sz w:val="26"/>
+      <w:color w:val="000000"/>
+      <w:sz w:val="24"/>
       <w:szCs w:val="26"/>
     </w:rPr>
   </w:style>
@@ -3709,10 +3857,11 @@
     <w:uiPriority w:val="9"/>
     <w:rsid w:val="00FC693F"/>
     <w:rPr>
-      <w:rFonts w:asciiTheme="majorHAnsi" w:eastAsiaTheme="majorEastAsia" w:hAnsiTheme="majorHAnsi" w:cstheme="majorBidi"/>
+      <w:rFonts w:asciiTheme="majorHAnsi" w:eastAsiaTheme="majorEastAsia" w:hAnsiTheme="majorHAnsi" w:cstheme="majorBidi" w:ascii="Arial" w:hAnsi="Arial" w:eastAsia="Arial" w:cs="Arial"/>
       <w:b/>
       <w:bCs/>
-      <w:color w:val="4F81BD" w:themeColor="accent1"/>
+      <w:color w:val="000000"/>
+      <w:sz w:val="24"/>
     </w:rPr>
   </w:style>
   <w:style w:type="paragraph" w:styleId="Title">
@@ -3731,11 +3880,11 @@
       <w:contextualSpacing/>
     </w:pPr>
     <w:rPr>
-      <w:rFonts w:asciiTheme="majorHAnsi" w:eastAsiaTheme="majorEastAsia" w:hAnsiTheme="majorHAnsi" w:cstheme="majorBidi"/>
-      <w:color w:val="17365D" w:themeColor="text2" w:themeShade="BF"/>
+      <w:rFonts w:asciiTheme="majorHAnsi" w:eastAsiaTheme="majorEastAsia" w:hAnsiTheme="majorHAnsi" w:cstheme="majorBidi" w:ascii="Arial" w:hAnsi="Arial" w:eastAsia="Arial" w:cs="Arial"/>
+      <w:color w:val="000000"/>
       <w:spacing w:val="5"/>
       <w:kern w:val="28"/>
-      <w:sz w:val="52"/>
+      <w:sz w:val="24"/>
       <w:szCs w:val="52"/>
     </w:rPr>
   </w:style>
@@ -3746,11 +3895,11 @@
     <w:uiPriority w:val="10"/>
     <w:rsid w:val="00FC693F"/>
     <w:rPr>
-      <w:rFonts w:asciiTheme="majorHAnsi" w:eastAsiaTheme="majorEastAsia" w:hAnsiTheme="majorHAnsi" w:cstheme="majorBidi"/>
-      <w:color w:val="17365D" w:themeColor="text2" w:themeShade="BF"/>
+      <w:rFonts w:asciiTheme="majorHAnsi" w:eastAsiaTheme="majorEastAsia" w:hAnsiTheme="majorHAnsi" w:cstheme="majorBidi" w:ascii="Arial" w:hAnsi="Arial" w:eastAsia="Arial" w:cs="Arial"/>
+      <w:color w:val="000000"/>
       <w:spacing w:val="5"/>
       <w:kern w:val="28"/>
-      <w:sz w:val="52"/>
+      <w:sz w:val="24"/>
       <w:szCs w:val="52"/>
     </w:rPr>
   </w:style>
@@ -3768,10 +3917,10 @@
       </w:numPr>
     </w:pPr>
     <w:rPr>
-      <w:rFonts w:asciiTheme="majorHAnsi" w:eastAsiaTheme="majorEastAsia" w:hAnsiTheme="majorHAnsi" w:cstheme="majorBidi"/>
+      <w:rFonts w:asciiTheme="majorHAnsi" w:eastAsiaTheme="majorEastAsia" w:hAnsiTheme="majorHAnsi" w:cstheme="majorBidi" w:ascii="Arial" w:hAnsi="Arial" w:eastAsia="Arial" w:cs="Arial"/>
       <w:i/>
       <w:iCs/>
-      <w:color w:val="4F81BD" w:themeColor="accent1"/>
+      <w:color w:val="000000"/>
       <w:spacing w:val="15"/>
       <w:sz w:val="24"/>
       <w:szCs w:val="24"/>
@@ -3784,10 +3933,10 @@
     <w:uiPriority w:val="11"/>
     <w:rsid w:val="00FC693F"/>
     <w:rPr>
-      <w:rFonts w:asciiTheme="majorHAnsi" w:eastAsiaTheme="majorEastAsia" w:hAnsiTheme="majorHAnsi" w:cstheme="majorBidi"/>
+      <w:rFonts w:asciiTheme="majorHAnsi" w:eastAsiaTheme="majorEastAsia" w:hAnsiTheme="majorHAnsi" w:cstheme="majorBidi" w:ascii="Arial" w:hAnsi="Arial" w:eastAsia="Arial" w:cs="Arial"/>
       <w:i/>
       <w:iCs/>
-      <w:color w:val="4F81BD" w:themeColor="accent1"/>
+      <w:color w:val="000000"/>
       <w:spacing w:val="15"/>
       <w:sz w:val="24"/>
       <w:szCs w:val="24"/>
@@ -3803,6 +3952,11 @@
       <w:ind w:left="720"/>
       <w:contextualSpacing/>
     </w:pPr>
+    <w:rPr>
+      <w:rFonts w:ascii="Arial" w:hAnsi="Arial" w:eastAsia="Arial" w:cs="Arial"/>
+      <w:color w:val="000000"/>
+      <w:sz w:val="24"/>
+    </w:rPr>
   </w:style>
   <w:style w:type="paragraph" w:styleId="BodyText">
     <w:name w:val="Body Text"/>
@@ -3814,6 +3968,11 @@
     <w:pPr>
       <w:spacing w:after="120"/>
     </w:pPr>
+    <w:rPr>
+      <w:rFonts w:ascii="Arial" w:hAnsi="Arial" w:eastAsia="Arial" w:cs="Arial"/>
+      <w:color w:val="000000"/>
+      <w:sz w:val="24"/>
+    </w:rPr>
   </w:style>
   <w:style w:type="character" w:customStyle="1" w:styleId="BodyTextChar">
     <w:name w:val="Body Text Char"/>
@@ -3821,6 +3980,11 @@
     <w:link w:val="BodyText"/>
     <w:uiPriority w:val="99"/>
     <w:rsid w:val="00AA1D8D"/>
+    <w:rPr>
+      <w:rFonts w:ascii="Arial" w:hAnsi="Arial" w:eastAsia="Arial" w:cs="Arial"/>
+      <w:color w:val="000000"/>
+      <w:sz w:val="24"/>
+    </w:rPr>
   </w:style>
   <w:style w:type="paragraph" w:styleId="BodyText2">
     <w:name w:val="Body Text 2"/>
@@ -3832,6 +3996,11 @@
     <w:pPr>
       <w:spacing w:after="120" w:line="480" w:lineRule="auto"/>
     </w:pPr>
+    <w:rPr>
+      <w:rFonts w:ascii="Arial" w:hAnsi="Arial" w:eastAsia="Arial" w:cs="Arial"/>
+      <w:color w:val="000000"/>
+      <w:sz w:val="24"/>
+    </w:rPr>
   </w:style>
   <w:style w:type="character" w:customStyle="1" w:styleId="BodyText2Char">
     <w:name w:val="Body Text 2 Char"/>
@@ -3839,6 +4008,11 @@
     <w:link w:val="BodyText2"/>
     <w:uiPriority w:val="99"/>
     <w:rsid w:val="00AA1D8D"/>
+    <w:rPr>
+      <w:rFonts w:ascii="Arial" w:hAnsi="Arial" w:eastAsia="Arial" w:cs="Arial"/>
+      <w:color w:val="000000"/>
+      <w:sz w:val="24"/>
+    </w:rPr>
   </w:style>
   <w:style w:type="paragraph" w:styleId="BodyText3">
     <w:name w:val="Body Text 3"/>
@@ -3851,7 +4025,9 @@
       <w:spacing w:after="120"/>
     </w:pPr>
     <w:rPr>
-      <w:sz w:val="16"/>
+      <w:rFonts w:ascii="Arial" w:hAnsi="Arial" w:eastAsia="Arial" w:cs="Arial"/>
+      <w:color w:val="000000"/>
+      <w:sz w:val="24"/>
       <w:szCs w:val="16"/>
     </w:rPr>
   </w:style>
@@ -3862,7 +4038,9 @@
     <w:uiPriority w:val="99"/>
     <w:rsid w:val="00AA1D8D"/>
     <w:rPr>
-      <w:sz w:val="16"/>
+      <w:rFonts w:ascii="Arial" w:hAnsi="Arial" w:eastAsia="Arial" w:cs="Arial"/>
+      <w:color w:val="000000"/>
+      <w:sz w:val="24"/>
       <w:szCs w:val="16"/>
     </w:rPr>
   </w:style>
@@ -3876,6 +4054,11 @@
       <w:ind w:left="360" w:hanging="360"/>
       <w:contextualSpacing/>
     </w:pPr>
+    <w:rPr>
+      <w:rFonts w:ascii="Arial" w:hAnsi="Arial" w:eastAsia="Arial" w:cs="Arial"/>
+      <w:color w:val="000000"/>
+      <w:sz w:val="24"/>
+    </w:rPr>
   </w:style>
   <w:style w:type="paragraph" w:styleId="List2">
     <w:name w:val="List 2"/>
@@ -3887,6 +4070,11 @@
       <w:ind w:left="720" w:hanging="360"/>
       <w:contextualSpacing/>
     </w:pPr>
+    <w:rPr>
+      <w:rFonts w:ascii="Arial" w:hAnsi="Arial" w:eastAsia="Arial" w:cs="Arial"/>
+      <w:color w:val="000000"/>
+      <w:sz w:val="24"/>
+    </w:rPr>
   </w:style>
   <w:style w:type="paragraph" w:styleId="List3">
     <w:name w:val="List 3"/>
@@ -3898,6 +4086,11 @@
       <w:ind w:left="1080" w:hanging="360"/>
       <w:contextualSpacing/>
     </w:pPr>
+    <w:rPr>
+      <w:rFonts w:ascii="Arial" w:hAnsi="Arial" w:eastAsia="Arial" w:cs="Arial"/>
+      <w:color w:val="000000"/>
+      <w:sz w:val="24"/>
+    </w:rPr>
   </w:style>
   <w:style w:type="paragraph" w:styleId="ListBullet">
     <w:name w:val="List Bullet"/>
@@ -3911,6 +4104,11 @@
       </w:numPr>
       <w:contextualSpacing/>
     </w:pPr>
+    <w:rPr>
+      <w:rFonts w:ascii="Arial" w:hAnsi="Arial" w:eastAsia="Arial" w:cs="Arial"/>
+      <w:color w:val="000000"/>
+      <w:sz w:val="24"/>
+    </w:rPr>
   </w:style>
   <w:style w:type="paragraph" w:styleId="ListBullet2">
     <w:name w:val="List Bullet 2"/>
@@ -3924,6 +4122,11 @@
       </w:numPr>
       <w:contextualSpacing/>
     </w:pPr>
+    <w:rPr>
+      <w:rFonts w:ascii="Arial" w:hAnsi="Arial" w:eastAsia="Arial" w:cs="Arial"/>
+      <w:color w:val="000000"/>
+      <w:sz w:val="24"/>
+    </w:rPr>
   </w:style>
   <w:style w:type="paragraph" w:styleId="ListBullet3">
     <w:name w:val="List Bullet 3"/>
@@ -3937,6 +4140,11 @@
       </w:numPr>
       <w:contextualSpacing/>
     </w:pPr>
+    <w:rPr>
+      <w:rFonts w:ascii="Arial" w:hAnsi="Arial" w:eastAsia="Arial" w:cs="Arial"/>
+      <w:color w:val="000000"/>
+      <w:sz w:val="24"/>
+    </w:rPr>
   </w:style>
   <w:style w:type="paragraph" w:styleId="ListNumber">
     <w:name w:val="List Number"/>
@@ -3950,6 +4158,11 @@
       </w:numPr>
       <w:contextualSpacing/>
     </w:pPr>
+    <w:rPr>
+      <w:rFonts w:ascii="Arial" w:hAnsi="Arial" w:eastAsia="Arial" w:cs="Arial"/>
+      <w:color w:val="000000"/>
+      <w:sz w:val="24"/>
+    </w:rPr>
   </w:style>
   <w:style w:type="paragraph" w:styleId="ListNumber2">
     <w:name w:val="List Number 2"/>
@@ -3963,6 +4176,11 @@
       </w:numPr>
       <w:contextualSpacing/>
     </w:pPr>
+    <w:rPr>
+      <w:rFonts w:ascii="Arial" w:hAnsi="Arial" w:eastAsia="Arial" w:cs="Arial"/>
+      <w:color w:val="000000"/>
+      <w:sz w:val="24"/>
+    </w:rPr>
   </w:style>
   <w:style w:type="paragraph" w:styleId="ListNumber3">
     <w:name w:val="List Number 3"/>
@@ -3976,6 +4194,11 @@
       </w:numPr>
       <w:contextualSpacing/>
     </w:pPr>
+    <w:rPr>
+      <w:rFonts w:ascii="Arial" w:hAnsi="Arial" w:eastAsia="Arial" w:cs="Arial"/>
+      <w:color w:val="000000"/>
+      <w:sz w:val="24"/>
+    </w:rPr>
   </w:style>
   <w:style w:type="paragraph" w:styleId="ListContinue">
     <w:name w:val="List Continue"/>
@@ -3988,6 +4211,11 @@
       <w:ind w:left="360"/>
       <w:contextualSpacing/>
     </w:pPr>
+    <w:rPr>
+      <w:rFonts w:ascii="Arial" w:hAnsi="Arial" w:eastAsia="Arial" w:cs="Arial"/>
+      <w:color w:val="000000"/>
+      <w:sz w:val="24"/>
+    </w:rPr>
   </w:style>
   <w:style w:type="paragraph" w:styleId="ListContinue2">
     <w:name w:val="List Continue 2"/>
@@ -4000,6 +4228,11 @@
       <w:ind w:left="720"/>
       <w:contextualSpacing/>
     </w:pPr>
+    <w:rPr>
+      <w:rFonts w:ascii="Arial" w:hAnsi="Arial" w:eastAsia="Arial" w:cs="Arial"/>
+      <w:color w:val="000000"/>
+      <w:sz w:val="24"/>
+    </w:rPr>
   </w:style>
   <w:style w:type="paragraph" w:styleId="ListContinue3">
     <w:name w:val="List Continue 3"/>
@@ -4012,6 +4245,11 @@
       <w:ind w:left="1080"/>
       <w:contextualSpacing/>
     </w:pPr>
+    <w:rPr>
+      <w:rFonts w:ascii="Arial" w:hAnsi="Arial" w:eastAsia="Arial" w:cs="Arial"/>
+      <w:color w:val="000000"/>
+      <w:sz w:val="24"/>
+    </w:rPr>
   </w:style>
   <w:style w:type="paragraph" w:styleId="MacroText">
     <w:name w:val="macro"/>
@@ -4031,8 +4269,9 @@
       </w:tabs>
     </w:pPr>
     <w:rPr>
-      <w:rFonts w:ascii="Courier" w:hAnsi="Courier"/>
-      <w:sz w:val="20"/>
+      <w:rFonts w:ascii="Arial" w:hAnsi="Arial" w:eastAsia="Arial" w:cs="Arial"/>
+      <w:color w:val="000000"/>
+      <w:sz w:val="24"/>
       <w:szCs w:val="20"/>
     </w:rPr>
   </w:style>
@@ -4043,8 +4282,9 @@
     <w:uiPriority w:val="99"/>
     <w:rsid w:val="0029639D"/>
     <w:rPr>
-      <w:rFonts w:ascii="Courier" w:hAnsi="Courier"/>
-      <w:sz w:val="20"/>
+      <w:rFonts w:ascii="Arial" w:hAnsi="Arial" w:eastAsia="Arial" w:cs="Arial"/>
+      <w:color w:val="000000"/>
+      <w:sz w:val="24"/>
       <w:szCs w:val="20"/>
     </w:rPr>
   </w:style>
@@ -4057,9 +4297,11 @@
     <w:qFormat/>
     <w:rsid w:val="00FC693F"/>
     <w:rPr>
+      <w:rFonts w:ascii="Arial" w:hAnsi="Arial" w:eastAsia="Arial" w:cs="Arial"/>
       <w:i/>
       <w:iCs/>
-      <w:color w:val="000000" w:themeColor="text1"/>
+      <w:color w:val="000000"/>
+      <w:sz w:val="24"/>
     </w:rPr>
   </w:style>
   <w:style w:type="character" w:customStyle="1" w:styleId="QuoteChar">
@@ -4069,9 +4311,11 @@
     <w:uiPriority w:val="29"/>
     <w:rsid w:val="00FC693F"/>
     <w:rPr>
+      <w:rFonts w:ascii="Arial" w:hAnsi="Arial" w:eastAsia="Arial" w:cs="Arial"/>
       <w:i/>
       <w:iCs/>
-      <w:color w:val="000000" w:themeColor="text1"/>
+      <w:color w:val="000000"/>
+      <w:sz w:val="24"/>
     </w:rPr>
   </w:style>
   <w:style w:type="character" w:customStyle="1" w:styleId="Heading4Char">
@@ -4082,12 +4326,13 @@
     <w:semiHidden/>
     <w:rsid w:val="00FC693F"/>
     <w:rPr>
-      <w:rFonts w:asciiTheme="majorHAnsi" w:eastAsiaTheme="majorEastAsia" w:hAnsiTheme="majorHAnsi" w:cstheme="majorBidi"/>
+      <w:rFonts w:asciiTheme="majorHAnsi" w:eastAsiaTheme="majorEastAsia" w:hAnsiTheme="majorHAnsi" w:cstheme="majorBidi" w:ascii="Arial" w:hAnsi="Arial" w:eastAsia="Arial" w:cs="Arial"/>
       <w:b/>
       <w:bCs/>
       <w:i/>
       <w:iCs/>
-      <w:color w:val="4F81BD" w:themeColor="accent1"/>
+      <w:color w:val="000000"/>
+      <w:sz w:val="24"/>
     </w:rPr>
   </w:style>
   <w:style w:type="character" w:customStyle="1" w:styleId="Heading5Char">
@@ -4098,8 +4343,9 @@
     <w:semiHidden/>
     <w:rsid w:val="00FC693F"/>
     <w:rPr>
-      <w:rFonts w:asciiTheme="majorHAnsi" w:eastAsiaTheme="majorEastAsia" w:hAnsiTheme="majorHAnsi" w:cstheme="majorBidi"/>
-      <w:color w:val="243F60" w:themeColor="accent1" w:themeShade="7F"/>
+      <w:rFonts w:asciiTheme="majorHAnsi" w:eastAsiaTheme="majorEastAsia" w:hAnsiTheme="majorHAnsi" w:cstheme="majorBidi" w:ascii="Arial" w:hAnsi="Arial" w:eastAsia="Arial" w:cs="Arial"/>
+      <w:color w:val="000000"/>
+      <w:sz w:val="24"/>
     </w:rPr>
   </w:style>
   <w:style w:type="character" w:customStyle="1" w:styleId="Heading6Char">
@@ -4110,10 +4356,11 @@
     <w:semiHidden/>
     <w:rsid w:val="00FC693F"/>
     <w:rPr>
-      <w:rFonts w:asciiTheme="majorHAnsi" w:eastAsiaTheme="majorEastAsia" w:hAnsiTheme="majorHAnsi" w:cstheme="majorBidi"/>
+      <w:rFonts w:asciiTheme="majorHAnsi" w:eastAsiaTheme="majorEastAsia" w:hAnsiTheme="majorHAnsi" w:cstheme="majorBidi" w:ascii="Arial" w:hAnsi="Arial" w:eastAsia="Arial" w:cs="Arial"/>
       <w:i/>
       <w:iCs/>
-      <w:color w:val="243F60" w:themeColor="accent1" w:themeShade="7F"/>
+      <w:color w:val="000000"/>
+      <w:sz w:val="24"/>
     </w:rPr>
   </w:style>
   <w:style w:type="character" w:customStyle="1" w:styleId="Heading7Char">
@@ -4124,10 +4371,11 @@
     <w:semiHidden/>
     <w:rsid w:val="00FC693F"/>
     <w:rPr>
-      <w:rFonts w:asciiTheme="majorHAnsi" w:eastAsiaTheme="majorEastAsia" w:hAnsiTheme="majorHAnsi" w:cstheme="majorBidi"/>
+      <w:rFonts w:asciiTheme="majorHAnsi" w:eastAsiaTheme="majorEastAsia" w:hAnsiTheme="majorHAnsi" w:cstheme="majorBidi" w:ascii="Arial" w:hAnsi="Arial" w:eastAsia="Arial" w:cs="Arial"/>
       <w:i/>
       <w:iCs/>
-      <w:color w:val="404040" w:themeColor="text1" w:themeTint="BF"/>
+      <w:color w:val="000000"/>
+      <w:sz w:val="24"/>
     </w:rPr>
   </w:style>
   <w:style w:type="character" w:customStyle="1" w:styleId="Heading8Char">
@@ -4138,9 +4386,9 @@
     <w:semiHidden/>
     <w:rsid w:val="00FC693F"/>
     <w:rPr>
-      <w:rFonts w:asciiTheme="majorHAnsi" w:eastAsiaTheme="majorEastAsia" w:hAnsiTheme="majorHAnsi" w:cstheme="majorBidi"/>
-      <w:color w:val="4F81BD" w:themeColor="accent1"/>
-      <w:sz w:val="20"/>
+      <w:rFonts w:asciiTheme="majorHAnsi" w:eastAsiaTheme="majorEastAsia" w:hAnsiTheme="majorHAnsi" w:cstheme="majorBidi" w:ascii="Arial" w:hAnsi="Arial" w:eastAsia="Arial" w:cs="Arial"/>
+      <w:color w:val="000000"/>
+      <w:sz w:val="24"/>
       <w:szCs w:val="20"/>
     </w:rPr>
   </w:style>
@@ -4152,11 +4400,11 @@
     <w:semiHidden/>
     <w:rsid w:val="00FC693F"/>
     <w:rPr>
-      <w:rFonts w:asciiTheme="majorHAnsi" w:eastAsiaTheme="majorEastAsia" w:hAnsiTheme="majorHAnsi" w:cstheme="majorBidi"/>
+      <w:rFonts w:asciiTheme="majorHAnsi" w:eastAsiaTheme="majorEastAsia" w:hAnsiTheme="majorHAnsi" w:cstheme="majorBidi" w:ascii="Arial" w:hAnsi="Arial" w:eastAsia="Arial" w:cs="Arial"/>
       <w:i/>
       <w:iCs/>
-      <w:color w:val="404040" w:themeColor="text1" w:themeTint="BF"/>
-      <w:sz w:val="20"/>
+      <w:color w:val="000000"/>
+      <w:sz w:val="24"/>
       <w:szCs w:val="20"/>
     </w:rPr>
   </w:style>
@@ -4173,10 +4421,11 @@
       <w:spacing w:line="240" w:lineRule="auto"/>
     </w:pPr>
     <w:rPr>
+      <w:rFonts w:ascii="Arial" w:hAnsi="Arial" w:eastAsia="Arial" w:cs="Arial"/>
       <w:b/>
       <w:bCs/>
-      <w:color w:val="4F81BD" w:themeColor="accent1"/>
-      <w:sz w:val="18"/>
+      <w:color w:val="000000"/>
+      <w:sz w:val="24"/>
       <w:szCs w:val="18"/>
     </w:rPr>
   </w:style>
@@ -4187,8 +4436,11 @@
     <w:qFormat/>
     <w:rsid w:val="00FC693F"/>
     <w:rPr>
+      <w:rFonts w:ascii="Arial" w:hAnsi="Arial" w:eastAsia="Arial" w:cs="Arial"/>
       <w:b/>
       <w:bCs/>
+      <w:color w:val="000000"/>
+      <w:sz w:val="24"/>
     </w:rPr>
   </w:style>
   <w:style w:type="character" w:styleId="Emphasis">
@@ -4198,8 +4450,11 @@
     <w:qFormat/>
     <w:rsid w:val="00FC693F"/>
     <w:rPr>
+      <w:rFonts w:ascii="Arial" w:hAnsi="Arial" w:eastAsia="Arial" w:cs="Arial"/>
       <w:i/>
       <w:iCs/>
+      <w:color w:val="000000"/>
+      <w:sz w:val="24"/>
     </w:rPr>
   </w:style>
   <w:style w:type="paragraph" w:styleId="IntenseQuote">
@@ -4218,11 +4473,13 @@
       <w:ind w:left="936" w:right="936"/>
     </w:pPr>
     <w:rPr>
+      <w:rFonts w:ascii="Arial" w:hAnsi="Arial" w:eastAsia="Arial" w:cs="Arial"/>
       <w:b/>
       <w:bCs/>
       <w:i/>
       <w:iCs/>
-      <w:color w:val="4F81BD" w:themeColor="accent1"/>
+      <w:color w:val="000000"/>
+      <w:sz w:val="24"/>
     </w:rPr>
   </w:style>
   <w:style w:type="character" w:customStyle="1" w:styleId="IntenseQuoteChar">
@@ -4232,11 +4489,13 @@
     <w:uiPriority w:val="30"/>
     <w:rsid w:val="00FC693F"/>
     <w:rPr>
+      <w:rFonts w:ascii="Arial" w:hAnsi="Arial" w:eastAsia="Arial" w:cs="Arial"/>
       <w:b/>
       <w:bCs/>
       <w:i/>
       <w:iCs/>
-      <w:color w:val="4F81BD" w:themeColor="accent1"/>
+      <w:color w:val="000000"/>
+      <w:sz w:val="24"/>
     </w:rPr>
   </w:style>
   <w:style w:type="character" w:styleId="SubtleEmphasis">
@@ -4246,9 +4505,11 @@
     <w:qFormat/>
     <w:rsid w:val="00FC693F"/>
     <w:rPr>
+      <w:rFonts w:ascii="Arial" w:hAnsi="Arial" w:eastAsia="Arial" w:cs="Arial"/>
       <w:i/>
       <w:iCs/>
-      <w:color w:val="808080" w:themeColor="text1" w:themeTint="7F"/>
+      <w:color w:val="000000"/>
+      <w:sz w:val="24"/>
     </w:rPr>
   </w:style>
   <w:style w:type="character" w:styleId="IntenseEmphasis">
@@ -4258,11 +4519,13 @@
     <w:qFormat/>
     <w:rsid w:val="00FC693F"/>
     <w:rPr>
+      <w:rFonts w:ascii="Arial" w:hAnsi="Arial" w:eastAsia="Arial" w:cs="Arial"/>
       <w:b/>
       <w:bCs/>
       <w:i/>
       <w:iCs/>
-      <w:color w:val="4F81BD" w:themeColor="accent1"/>
+      <w:color w:val="000000"/>
+      <w:sz w:val="24"/>
     </w:rPr>
   </w:style>
   <w:style w:type="character" w:styleId="SubtleReference">
@@ -4272,8 +4535,10 @@
     <w:qFormat/>
     <w:rsid w:val="00FC693F"/>
     <w:rPr>
+      <w:rFonts w:ascii="Arial" w:hAnsi="Arial" w:eastAsia="Arial" w:cs="Arial"/>
       <w:smallCaps/>
-      <w:color w:val="C0504D" w:themeColor="accent2"/>
+      <w:color w:val="000000"/>
+      <w:sz w:val="24"/>
       <w:u w:val="single"/>
     </w:rPr>
   </w:style>
@@ -4284,11 +4549,13 @@
     <w:qFormat/>
     <w:rsid w:val="00FC693F"/>
     <w:rPr>
+      <w:rFonts w:ascii="Arial" w:hAnsi="Arial" w:eastAsia="Arial" w:cs="Arial"/>
       <w:b/>
       <w:bCs/>
       <w:smallCaps/>
-      <w:color w:val="C0504D" w:themeColor="accent2"/>
+      <w:color w:val="000000"/>
       <w:spacing w:val="5"/>
+      <w:sz w:val="24"/>
       <w:u w:val="single"/>
     </w:rPr>
   </w:style>
@@ -4299,10 +4566,13 @@
     <w:qFormat/>
     <w:rsid w:val="00FC693F"/>
     <w:rPr>
+      <w:rFonts w:ascii="Arial" w:hAnsi="Arial" w:eastAsia="Arial" w:cs="Arial"/>
       <w:b/>
       <w:bCs/>
       <w:smallCaps/>
+      <w:color w:val="000000"/>
       <w:spacing w:val="5"/>
+      <w:sz w:val="24"/>
     </w:rPr>
   </w:style>
   <w:style w:type="paragraph" w:styleId="TOCHeading">
@@ -4317,6 +4587,11 @@
     <w:pPr>
       <w:outlineLvl w:val="9"/>
     </w:pPr>
+    <w:rPr>
+      <w:rFonts w:ascii="Arial" w:hAnsi="Arial" w:eastAsia="Arial" w:cs="Arial"/>
+      <w:color w:val="000000"/>
+      <w:sz w:val="24"/>
+    </w:rPr>
   </w:style>
   <w:style w:type="table" w:styleId="TableGrid">
     <w:name w:val="Table Grid"/>

</xml_diff>